<commit_message>
added all task 4 diagrams
</commit_message>
<xml_diff>
--- a/COS214_P4.docx
+++ b/COS214_P4.docx
@@ -7,15 +7,7 @@
         <w:pStyle w:val="Heading3"/>
       </w:pPr>
       <w:r>
-        <w:t xml:space="preserve">Group20: Kiara </w:t>
-      </w:r>
-      <w:proofErr w:type="spellStart"/>
-      <w:r>
-        <w:t>Ajodhaparsadh</w:t>
-      </w:r>
-      <w:proofErr w:type="spellEnd"/>
-      <w:r>
-        <w:t>(u25395344),</w:t>
+        <w:t>Group20: Kiara Ajodhaparsadh(u25395344),</w:t>
       </w:r>
     </w:p>
     <w:p>
@@ -55,13 +47,8 @@
       </w:r>
     </w:p>
     <w:p>
-      <w:proofErr w:type="spellStart"/>
-      <w:r>
-        <w:t>TaskForge</w:t>
-      </w:r>
-      <w:proofErr w:type="spellEnd"/>
-      <w:r>
-        <w:t xml:space="preserve"> is a reusable work-processing system designed to manage the work involved in producing a film. Film production contains a large bo</w:t>
+      <w:r>
+        <w:t>TaskForge is a reusable work-processing system designed to manage the work involved in producing a film. Film production contains a large bo</w:t>
       </w:r>
       <w:r>
         <w:t>dy of work that can be broken</w:t>
@@ -72,15 +59,7 @@
     </w:p>
     <w:p>
       <w:r>
-        <w:t xml:space="preserve">The problem </w:t>
-      </w:r>
-      <w:proofErr w:type="spellStart"/>
-      <w:r>
-        <w:t>TaskForge</w:t>
-      </w:r>
-      <w:proofErr w:type="spellEnd"/>
-      <w:r>
-        <w:t xml:space="preserve"> solves is the difficulty of organising, processing and monitoring this hierarchical body of work while allowing production staff to:</w:t>
+        <w:t>The problem TaskForge solves is the difficulty of organising, processing and monitoring this hierarchical body of work while allowing production staff to:</w:t>
       </w:r>
       <w:r>
         <w:t xml:space="preserve"> </w:t>
@@ -121,37 +100,16 @@
           <w:rStyle w:val="SubtleEmphasis"/>
         </w:rPr>
       </w:pPr>
-      <w:proofErr w:type="spellStart"/>
       <w:r>
         <w:rPr>
           <w:rStyle w:val="SubtleEmphasis"/>
         </w:rPr>
-        <w:t>TaskForge</w:t>
-      </w:r>
-      <w:proofErr w:type="spellEnd"/>
-      <w:r>
-        <w:rPr>
-          <w:rStyle w:val="SubtleEmphasis"/>
-        </w:rPr>
-        <w:t xml:space="preserve"> System Overview</w:t>
-      </w:r>
-    </w:p>
-    <w:p>
-      <w:proofErr w:type="spellStart"/>
-      <w:r>
-        <w:t>TaskForge</w:t>
-      </w:r>
-      <w:proofErr w:type="spellEnd"/>
-      <w:r>
-        <w:t xml:space="preserve"> is a hierarchical work-processing system designed for managing the work involved in producing a film. A film production consists of many pieces of work that are organised into groups, such as production phases, scenes, and individual production tasks. </w:t>
-      </w:r>
-      <w:proofErr w:type="spellStart"/>
-      <w:r>
-        <w:t>TaskForge</w:t>
-      </w:r>
-      <w:proofErr w:type="spellEnd"/>
-      <w:r>
-        <w:t xml:space="preserve"> represents this work as a hierarchy in which both individual tasks and groups of tasks can be treated uniformly (composite DP).</w:t>
+        <w:t>TaskForge System Overview</w:t>
+      </w:r>
+    </w:p>
+    <w:p>
+      <w:r>
+        <w:t>TaskForge is a hierarchical work-processing system designed for managing the work involved in producing a film. A film production consists of many pieces of work that are organised into groups, such as production phases, scenes, and individual production tasks. TaskForge represents this work as a hierarchy in which both individual tasks and groups of tasks can be treated uniformly (composite DP).</w:t>
       </w:r>
     </w:p>
     <w:p>
@@ -224,22 +182,9 @@
       </w:r>
     </w:p>
     <w:p>
-      <w:proofErr w:type="spellStart"/>
       <w:r>
         <w:lastRenderedPageBreak/>
-        <w:t>TaskForge</w:t>
-      </w:r>
-      <w:proofErr w:type="spellEnd"/>
-      <w:r>
-        <w:t xml:space="preserve"> also allows additional responsibilities to be added to work items at runtime. For example, a safety check or equipment check can be added to a filming task without modifying the original task. These responsibilities can be stacked, allowing a single task to have multiple additional requirements while remaining usable through the same </w:t>
-      </w:r>
-      <w:proofErr w:type="spellStart"/>
-      <w:r>
-        <w:t>WorkItem</w:t>
-      </w:r>
-      <w:proofErr w:type="spellEnd"/>
-      <w:r>
-        <w:t xml:space="preserve"> abstraction</w:t>
+        <w:t>TaskForge also allows additional responsibilities to be added to work items at runtime. For example, a safety check or equipment check can be added to a filming task without modifying the original task. These responsibilities can be stacked, allowing a single task to have multiple additional requirements while remaining usable through the same WorkItem abstraction</w:t>
       </w:r>
       <w:r>
         <w:t xml:space="preserve"> (Decorator DP)</w:t>
@@ -250,15 +195,7 @@
     </w:p>
     <w:p>
       <w:r>
-        <w:t xml:space="preserve">Finally, the production hierarchy can change while the system is running. For example, a task can be moved from one scene or production group to another. </w:t>
-      </w:r>
-      <w:proofErr w:type="spellStart"/>
-      <w:r>
-        <w:t>TaskForge</w:t>
-      </w:r>
-      <w:proofErr w:type="spellEnd"/>
-      <w:r>
-        <w:t xml:space="preserve"> uses a deliberate </w:t>
+        <w:t xml:space="preserve">Finally, the production hierarchy can change while the system is running. For example, a task can be moved from one scene or production group to another. TaskForge uses a deliberate </w:t>
       </w:r>
       <w:r>
         <w:rPr>
@@ -272,15 +209,7 @@
     </w:p>
     <w:p>
       <w:r>
-        <w:t xml:space="preserve">Overall, </w:t>
-      </w:r>
-      <w:proofErr w:type="spellStart"/>
-      <w:r>
-        <w:t>TaskForge</w:t>
-      </w:r>
-      <w:proofErr w:type="spellEnd"/>
-      <w:r>
-        <w:t xml:space="preserve"> provides a single system for organising, traversing, processing, monitoring, and dynamically modifying film-production work. The Composite, Iterator, State, and Decorator patterns work together as parts of this single workflow rather than as separate demonstrations of the patterns.</w:t>
+        <w:t>Overall, TaskForge provides a single system for organising, traversing, processing, monitoring, and dynamically modifying film-production work. The Composite, Iterator, State, and Decorator patterns work together as parts of this single workflow rather than as separate demonstrations of the patterns.</w:t>
       </w:r>
     </w:p>
     <w:p/>
@@ -308,25 +237,7 @@
           <w:rFonts w:eastAsiaTheme="minorEastAsia"/>
           <w:spacing w:val="15"/>
         </w:rPr>
-        <w:t xml:space="preserve">fication of the </w:t>
-      </w:r>
-      <w:proofErr w:type="spellStart"/>
-      <w:r>
-        <w:rPr>
-          <w:rStyle w:val="SubtleEmphasis"/>
-          <w:rFonts w:eastAsiaTheme="minorEastAsia"/>
-          <w:spacing w:val="15"/>
-        </w:rPr>
-        <w:t>GoF</w:t>
-      </w:r>
-      <w:proofErr w:type="spellEnd"/>
-      <w:r>
-        <w:rPr>
-          <w:rStyle w:val="SubtleEmphasis"/>
-          <w:rFonts w:eastAsiaTheme="minorEastAsia"/>
-          <w:spacing w:val="15"/>
-        </w:rPr>
-        <w:t xml:space="preserve"> participants</w:t>
+        <w:t>fication of the GoF participants</w:t>
       </w:r>
     </w:p>
     <w:p>
@@ -384,14 +295,12 @@
                 <w:b w:val="0"/>
               </w:rPr>
             </w:pPr>
-            <w:proofErr w:type="spellStart"/>
             <w:r>
               <w:rPr>
                 <w:b w:val="0"/>
               </w:rPr>
               <w:t>WorkItem</w:t>
             </w:r>
-            <w:proofErr w:type="spellEnd"/>
           </w:p>
         </w:tc>
         <w:tc>
@@ -437,11 +346,9 @@
             <w:pPr>
               <w:cnfStyle w:val="000000100000" w:firstRow="0" w:lastRow="0" w:firstColumn="0" w:lastColumn="0" w:oddVBand="0" w:evenVBand="0" w:oddHBand="1" w:evenHBand="0" w:firstRowFirstColumn="0" w:firstRowLastColumn="0" w:lastRowFirstColumn="0" w:lastRowLastColumn="0"/>
             </w:pPr>
-            <w:proofErr w:type="spellStart"/>
             <w:r>
               <w:t>WorkGroup</w:t>
             </w:r>
-            <w:proofErr w:type="spellEnd"/>
           </w:p>
         </w:tc>
         <w:tc>
@@ -453,13 +360,8 @@
               <w:cnfStyle w:val="000000100000" w:firstRow="0" w:lastRow="0" w:firstColumn="0" w:lastColumn="0" w:oddVBand="0" w:evenVBand="0" w:oddHBand="1" w:evenHBand="0" w:firstRowFirstColumn="0" w:firstRowLastColumn="0" w:lastRowFirstColumn="0" w:lastRowLastColumn="0"/>
             </w:pPr>
             <w:r>
-              <w:t xml:space="preserve">Represents a group that contains other </w:t>
-            </w:r>
-            <w:proofErr w:type="spellStart"/>
-            <w:r>
-              <w:t>WorkItems</w:t>
-            </w:r>
-            <w:proofErr w:type="spellEnd"/>
+              <w:t>Represents a group that contains other WorkItems</w:t>
+            </w:r>
           </w:p>
         </w:tc>
       </w:tr>
@@ -483,11 +385,9 @@
             <w:pPr>
               <w:cnfStyle w:val="000000000000" w:firstRow="0" w:lastRow="0" w:firstColumn="0" w:lastColumn="0" w:oddVBand="0" w:evenVBand="0" w:oddHBand="0" w:evenHBand="0" w:firstRowFirstColumn="0" w:firstRowLastColumn="0" w:lastRowFirstColumn="0" w:lastRowLastColumn="0"/>
             </w:pPr>
-            <w:proofErr w:type="spellStart"/>
             <w:r>
               <w:t>ProductionTask</w:t>
             </w:r>
-            <w:proofErr w:type="spellEnd"/>
           </w:p>
         </w:tc>
         <w:tc>
@@ -527,11 +427,9 @@
             <w:pPr>
               <w:cnfStyle w:val="000000100000" w:firstRow="0" w:lastRow="0" w:firstColumn="0" w:lastColumn="0" w:oddVBand="0" w:evenVBand="0" w:oddHBand="1" w:evenHBand="0" w:firstRowFirstColumn="0" w:firstRowLastColumn="0" w:lastRowFirstColumn="0" w:lastRowLastColumn="0"/>
             </w:pPr>
-            <w:proofErr w:type="spellStart"/>
             <w:r>
               <w:t>ProductionPhase</w:t>
             </w:r>
-            <w:proofErr w:type="spellEnd"/>
             <w:r>
               <w:t>(Pre-Production, production, post-production)</w:t>
             </w:r>
@@ -539,39 +437,7 @@
               <w:t>, Scene</w:t>
             </w:r>
             <w:r>
-              <w:t xml:space="preserve"> (</w:t>
-            </w:r>
-            <w:proofErr w:type="spellStart"/>
-            <w:r>
-              <w:t>OpeningScene</w:t>
-            </w:r>
-            <w:proofErr w:type="spellEnd"/>
-            <w:r>
-              <w:t xml:space="preserve">, </w:t>
-            </w:r>
-            <w:proofErr w:type="spellStart"/>
-            <w:r>
-              <w:t>ClosingScene</w:t>
-            </w:r>
-            <w:proofErr w:type="spellEnd"/>
-            <w:r>
-              <w:t xml:space="preserve">, </w:t>
-            </w:r>
-            <w:proofErr w:type="spellStart"/>
-            <w:r>
-              <w:t>ClimaxScene</w:t>
-            </w:r>
-            <w:proofErr w:type="spellEnd"/>
-            <w:r>
-              <w:t xml:space="preserve">, </w:t>
-            </w:r>
-            <w:proofErr w:type="spellStart"/>
-            <w:r>
-              <w:t>postClimaxScene</w:t>
-            </w:r>
-            <w:proofErr w:type="spellEnd"/>
-            <w:r>
-              <w:t>)</w:t>
+              <w:t xml:space="preserve"> (OpeningScene, ClosingScene, ClimaxScene, postClimaxScene)</w:t>
             </w:r>
           </w:p>
         </w:tc>
@@ -638,11 +504,9 @@
             <w:pPr>
               <w:cnfStyle w:val="100000000000" w:firstRow="1" w:lastRow="0" w:firstColumn="0" w:lastColumn="0" w:oddVBand="0" w:evenVBand="0" w:oddHBand="0" w:evenHBand="0" w:firstRowFirstColumn="0" w:firstRowLastColumn="0" w:lastRowFirstColumn="0" w:lastRowLastColumn="0"/>
             </w:pPr>
-            <w:proofErr w:type="spellStart"/>
             <w:r>
               <w:t>WorkIterator</w:t>
             </w:r>
-            <w:proofErr w:type="spellEnd"/>
           </w:p>
         </w:tc>
         <w:tc>
@@ -682,11 +546,9 @@
             <w:pPr>
               <w:cnfStyle w:val="000000100000" w:firstRow="0" w:lastRow="0" w:firstColumn="0" w:lastColumn="0" w:oddVBand="0" w:evenVBand="0" w:oddHBand="1" w:evenHBand="0" w:firstRowFirstColumn="0" w:firstRowLastColumn="0" w:lastRowFirstColumn="0" w:lastRowLastColumn="0"/>
             </w:pPr>
-            <w:proofErr w:type="spellStart"/>
             <w:r>
               <w:t>ProductionOrderIterator</w:t>
             </w:r>
-            <w:proofErr w:type="spellEnd"/>
           </w:p>
         </w:tc>
         <w:tc>
@@ -726,11 +588,9 @@
             <w:pPr>
               <w:cnfStyle w:val="000000000000" w:firstRow="0" w:lastRow="0" w:firstColumn="0" w:lastColumn="0" w:oddVBand="0" w:evenVBand="0" w:oddHBand="0" w:evenHBand="0" w:firstRowFirstColumn="0" w:firstRowLastColumn="0" w:lastRowFirstColumn="0" w:lastRowLastColumn="0"/>
             </w:pPr>
-            <w:proofErr w:type="spellStart"/>
             <w:r>
               <w:t>PriorityIterator</w:t>
             </w:r>
-            <w:proofErr w:type="spellEnd"/>
           </w:p>
         </w:tc>
         <w:tc>
@@ -770,19 +630,9 @@
             <w:pPr>
               <w:cnfStyle w:val="000000100000" w:firstRow="0" w:lastRow="0" w:firstColumn="0" w:lastColumn="0" w:oddVBand="0" w:evenVBand="0" w:oddHBand="1" w:evenHBand="0" w:firstRowFirstColumn="0" w:firstRowLastColumn="0" w:lastRowFirstColumn="0" w:lastRowLastColumn="0"/>
             </w:pPr>
-            <w:proofErr w:type="spellStart"/>
-            <w:r>
-              <w:t>WorkItem</w:t>
-            </w:r>
-            <w:proofErr w:type="spellEnd"/>
-            <w:r>
-              <w:t xml:space="preserve">/ </w:t>
-            </w:r>
-            <w:proofErr w:type="spellStart"/>
-            <w:r>
-              <w:t>WorkGroup</w:t>
-            </w:r>
-            <w:proofErr w:type="spellEnd"/>
+            <w:r>
+              <w:t>WorkItem/ WorkGroup</w:t>
+            </w:r>
           </w:p>
         </w:tc>
         <w:tc>
@@ -852,11 +702,9 @@
             <w:pPr>
               <w:cnfStyle w:val="100000000000" w:firstRow="1" w:lastRow="0" w:firstColumn="0" w:lastColumn="0" w:oddVBand="0" w:evenVBand="0" w:oddHBand="0" w:evenHBand="0" w:firstRowFirstColumn="0" w:firstRowLastColumn="0" w:lastRowFirstColumn="0" w:lastRowLastColumn="0"/>
             </w:pPr>
-            <w:proofErr w:type="spellStart"/>
             <w:r>
               <w:t>ProductionTask</w:t>
             </w:r>
-            <w:proofErr w:type="spellEnd"/>
           </w:p>
         </w:tc>
         <w:tc>
@@ -896,11 +744,9 @@
             <w:pPr>
               <w:cnfStyle w:val="000000100000" w:firstRow="0" w:lastRow="0" w:firstColumn="0" w:lastColumn="0" w:oddVBand="0" w:evenVBand="0" w:oddHBand="1" w:evenHBand="0" w:firstRowFirstColumn="0" w:firstRowLastColumn="0" w:lastRowFirstColumn="0" w:lastRowLastColumn="0"/>
             </w:pPr>
-            <w:proofErr w:type="spellStart"/>
             <w:r>
               <w:t>TaskState</w:t>
             </w:r>
-            <w:proofErr w:type="spellEnd"/>
           </w:p>
         </w:tc>
         <w:tc>
@@ -924,11 +770,9 @@
             <w:tcW w:w="3000" w:type="dxa"/>
           </w:tcPr>
           <w:p>
-            <w:proofErr w:type="spellStart"/>
             <w:r>
               <w:t>ConcreteState</w:t>
             </w:r>
-            <w:proofErr w:type="spellEnd"/>
           </w:p>
         </w:tc>
         <w:tc>
@@ -1012,11 +856,9 @@
             <w:pPr>
               <w:cnfStyle w:val="100000000000" w:firstRow="1" w:lastRow="0" w:firstColumn="0" w:lastColumn="0" w:oddVBand="0" w:evenVBand="0" w:oddHBand="0" w:evenHBand="0" w:firstRowFirstColumn="0" w:firstRowLastColumn="0" w:lastRowFirstColumn="0" w:lastRowLastColumn="0"/>
             </w:pPr>
-            <w:proofErr w:type="spellStart"/>
             <w:r>
               <w:t>WorkItem</w:t>
             </w:r>
-            <w:proofErr w:type="spellEnd"/>
           </w:p>
         </w:tc>
         <w:tc>
@@ -1059,53 +901,11 @@
             <w:pPr>
               <w:cnfStyle w:val="000000100000" w:firstRow="0" w:lastRow="0" w:firstColumn="0" w:lastColumn="0" w:oddVBand="0" w:evenVBand="0" w:oddHBand="1" w:evenHBand="0" w:firstRowFirstColumn="0" w:firstRowLastColumn="0" w:lastRowFirstColumn="0" w:lastRowLastColumn="0"/>
             </w:pPr>
-            <w:proofErr w:type="spellStart"/>
             <w:r>
               <w:t>ProductionTask</w:t>
             </w:r>
-            <w:proofErr w:type="spellEnd"/>
-            <w:r>
-              <w:t xml:space="preserve"> (</w:t>
-            </w:r>
-            <w:proofErr w:type="spellStart"/>
-            <w:r>
-              <w:t>castLead</w:t>
-            </w:r>
-            <w:proofErr w:type="spellEnd"/>
-            <w:r>
-              <w:t xml:space="preserve">, </w:t>
-            </w:r>
-            <w:proofErr w:type="spellStart"/>
-            <w:r>
-              <w:t>findLocation</w:t>
-            </w:r>
-            <w:proofErr w:type="spellEnd"/>
-            <w:r>
-              <w:t xml:space="preserve">, </w:t>
-            </w:r>
-            <w:proofErr w:type="spellStart"/>
-            <w:r>
-              <w:t>filmScene</w:t>
-            </w:r>
-            <w:proofErr w:type="spellEnd"/>
-            <w:r>
-              <w:t xml:space="preserve">, </w:t>
-            </w:r>
-            <w:proofErr w:type="spellStart"/>
-            <w:r>
-              <w:t>editScene</w:t>
-            </w:r>
-            <w:proofErr w:type="spellEnd"/>
-            <w:r>
-              <w:t xml:space="preserve">, </w:t>
-            </w:r>
-            <w:proofErr w:type="spellStart"/>
-            <w:r>
-              <w:t>addEffects</w:t>
-            </w:r>
-            <w:proofErr w:type="spellEnd"/>
-            <w:r>
-              <w:t>)</w:t>
+            <w:r>
+              <w:t xml:space="preserve"> (castLead, findLocation, filmScene, editScene, addEffects)</w:t>
             </w:r>
           </w:p>
         </w:tc>
@@ -1143,11 +943,9 @@
             <w:pPr>
               <w:cnfStyle w:val="000000000000" w:firstRow="0" w:lastRow="0" w:firstColumn="0" w:lastColumn="0" w:oddVBand="0" w:evenVBand="0" w:oddHBand="0" w:evenHBand="0" w:firstRowFirstColumn="0" w:firstRowLastColumn="0" w:lastRowFirstColumn="0" w:lastRowLastColumn="0"/>
             </w:pPr>
-            <w:proofErr w:type="spellStart"/>
             <w:r>
               <w:t>WorkItemDecorator</w:t>
             </w:r>
-            <w:proofErr w:type="spellEnd"/>
           </w:p>
         </w:tc>
         <w:tc>
@@ -1159,13 +957,8 @@
               <w:cnfStyle w:val="000000000000" w:firstRow="0" w:lastRow="0" w:firstColumn="0" w:lastColumn="0" w:oddVBand="0" w:evenVBand="0" w:oddHBand="0" w:evenHBand="0" w:firstRowFirstColumn="0" w:firstRowLastColumn="0" w:lastRowFirstColumn="0" w:lastRowLastColumn="0"/>
             </w:pPr>
             <w:r>
-              <w:t xml:space="preserve">Base wrapper implementing </w:t>
-            </w:r>
-            <w:proofErr w:type="spellStart"/>
-            <w:r>
-              <w:t>WorkItem</w:t>
-            </w:r>
-            <w:proofErr w:type="spellEnd"/>
+              <w:t>Base wrapper implementing WorkItem</w:t>
+            </w:r>
           </w:p>
         </w:tc>
       </w:tr>
@@ -1179,11 +972,9 @@
             <w:tcW w:w="3116" w:type="dxa"/>
           </w:tcPr>
           <w:p>
-            <w:proofErr w:type="spellStart"/>
             <w:r>
               <w:t>ConcreteDecorator</w:t>
             </w:r>
-            <w:proofErr w:type="spellEnd"/>
           </w:p>
         </w:tc>
         <w:tc>
@@ -1194,21 +985,14 @@
             <w:pPr>
               <w:cnfStyle w:val="000000100000" w:firstRow="0" w:lastRow="0" w:firstColumn="0" w:lastColumn="0" w:oddVBand="0" w:evenVBand="0" w:oddHBand="1" w:evenHBand="0" w:firstRowFirstColumn="0" w:firstRowLastColumn="0" w:lastRowFirstColumn="0" w:lastRowLastColumn="0"/>
             </w:pPr>
-            <w:proofErr w:type="spellStart"/>
             <w:r>
               <w:t>SafetyCheck</w:t>
             </w:r>
-            <w:proofErr w:type="spellEnd"/>
             <w:r>
               <w:t xml:space="preserve">, </w:t>
             </w:r>
-            <w:proofErr w:type="spellStart"/>
-            <w:r>
-              <w:t>EquipementCheck</w:t>
-            </w:r>
-            <w:proofErr w:type="spellEnd"/>
-            <w:r>
-              <w:t>, Insurance</w:t>
+            <w:r>
+              <w:t>EquipementCheck, Insurance</w:t>
             </w:r>
           </w:p>
         </w:tc>
@@ -1263,49 +1047,13 @@
         </w:rPr>
       </w:pPr>
       <w:r>
-        <w:t xml:space="preserve">Composite: </w:t>
-      </w:r>
-      <w:proofErr w:type="spellStart"/>
-      <w:r>
-        <w:t>WorkItem</w:t>
-      </w:r>
-      <w:proofErr w:type="spellEnd"/>
-      <w:r>
-        <w:t xml:space="preserve"> </w:t>
-      </w:r>
-      <w:r>
-        <w:rPr>
-          <w:rFonts w:cstheme="minorHAnsi"/>
-        </w:rPr>
-        <w:t xml:space="preserve">← </w:t>
-      </w:r>
-      <w:proofErr w:type="spellStart"/>
-      <w:r>
-        <w:rPr>
-          <w:rFonts w:cstheme="minorHAnsi"/>
-        </w:rPr>
-        <w:t>ProductionTask</w:t>
-      </w:r>
-      <w:proofErr w:type="spellEnd"/>
-      <w:r>
-        <w:rPr>
-          <w:rFonts w:cstheme="minorHAnsi"/>
-        </w:rPr>
-        <w:t xml:space="preserve">, </w:t>
-      </w:r>
-      <w:proofErr w:type="spellStart"/>
-      <w:r>
-        <w:rPr>
-          <w:rFonts w:cstheme="minorHAnsi"/>
-        </w:rPr>
-        <w:t>WorkGroup</w:t>
-      </w:r>
-      <w:proofErr w:type="spellEnd"/>
-      <w:r>
-        <w:rPr>
-          <w:rFonts w:cstheme="minorHAnsi"/>
-        </w:rPr>
-        <w:t xml:space="preserve"> </w:t>
+        <w:t xml:space="preserve">Composite: WorkItem </w:t>
+      </w:r>
+      <w:r>
+        <w:rPr>
+          <w:rFonts w:cstheme="minorHAnsi"/>
+        </w:rPr>
+        <w:t xml:space="preserve">← ProductionTask, WorkGroup </w:t>
       </w:r>
       <w:r>
         <w:rPr>
@@ -1317,48 +1065,20 @@
         <w:rPr>
           <w:rFonts w:cstheme="minorHAnsi"/>
         </w:rPr>
-        <w:t xml:space="preserve"> </w:t>
-      </w:r>
-      <w:proofErr w:type="spellStart"/>
-      <w:r>
-        <w:rPr>
-          <w:rFonts w:cstheme="minorHAnsi"/>
-        </w:rPr>
-        <w:t>ProductionPhase</w:t>
-      </w:r>
-      <w:proofErr w:type="spellEnd"/>
-      <w:r>
-        <w:rPr>
-          <w:rFonts w:cstheme="minorHAnsi"/>
-        </w:rPr>
-        <w:t>, Scene</w:t>
-      </w:r>
-    </w:p>
-    <w:p>
-      <w:pPr>
-        <w:rPr>
-          <w:rFonts w:cstheme="minorHAnsi"/>
-        </w:rPr>
-      </w:pPr>
-      <w:r>
-        <w:rPr>
-          <w:rFonts w:cstheme="minorHAnsi"/>
-        </w:rPr>
-        <w:t xml:space="preserve">Iterator: </w:t>
-      </w:r>
-      <w:proofErr w:type="spellStart"/>
-      <w:r>
-        <w:rPr>
-          <w:rFonts w:cstheme="minorHAnsi"/>
-        </w:rPr>
-        <w:t>WorkIterator</w:t>
-      </w:r>
-      <w:proofErr w:type="spellEnd"/>
-      <w:r>
-        <w:rPr>
-          <w:rFonts w:cstheme="minorHAnsi"/>
-        </w:rPr>
-        <w:t xml:space="preserve"> </w:t>
+        <w:t xml:space="preserve"> ProductionPhase, Scene</w:t>
+      </w:r>
+    </w:p>
+    <w:p>
+      <w:pPr>
+        <w:rPr>
+          <w:rFonts w:cstheme="minorHAnsi"/>
+        </w:rPr>
+      </w:pPr>
+      <w:r>
+        <w:rPr>
+          <w:rFonts w:cstheme="minorHAnsi"/>
+        </w:rPr>
+        <w:t xml:space="preserve">Iterator: WorkIterator </w:t>
       </w:r>
       <w:r>
         <w:rPr>
@@ -1370,30 +1090,8 @@
         <w:rPr>
           <w:rFonts w:cstheme="minorHAnsi"/>
         </w:rPr>
-        <w:t xml:space="preserve"> </w:t>
-      </w:r>
-      <w:proofErr w:type="spellStart"/>
-      <w:r>
-        <w:rPr>
-          <w:rFonts w:cstheme="minorHAnsi"/>
-        </w:rPr>
-        <w:t>ProductionOrderIterator</w:t>
-      </w:r>
-      <w:proofErr w:type="spellEnd"/>
-      <w:r>
-        <w:rPr>
-          <w:rFonts w:cstheme="minorHAnsi"/>
-        </w:rPr>
-        <w:t xml:space="preserve">, </w:t>
-      </w:r>
-      <w:proofErr w:type="spellStart"/>
-      <w:r>
-        <w:rPr>
-          <w:rFonts w:cstheme="minorHAnsi"/>
-        </w:rPr>
-        <w:t>PriorityIterator</w:t>
-      </w:r>
-      <w:proofErr w:type="spellEnd"/>
+        <w:t xml:space="preserve"> ProductionOrderIterator, PriorityIterator</w:t>
+      </w:r>
     </w:p>
     <w:p>
       <w:pPr>
@@ -1430,21 +1128,7 @@
         <w:rPr>
           <w:rFonts w:cstheme="minorHAnsi"/>
         </w:rPr>
-        <w:t xml:space="preserve">Decorator: </w:t>
-      </w:r>
-      <w:proofErr w:type="spellStart"/>
-      <w:r>
-        <w:rPr>
-          <w:rFonts w:cstheme="minorHAnsi"/>
-        </w:rPr>
-        <w:t>WorkItem</w:t>
-      </w:r>
-      <w:proofErr w:type="spellEnd"/>
-      <w:r>
-        <w:rPr>
-          <w:rFonts w:cstheme="minorHAnsi"/>
-        </w:rPr>
-        <w:t xml:space="preserve"> </w:t>
+        <w:t xml:space="preserve">Decorator: WorkItem </w:t>
       </w:r>
       <w:r>
         <w:rPr>
@@ -1456,21 +1140,7 @@
         <w:rPr>
           <w:rFonts w:cstheme="minorHAnsi"/>
         </w:rPr>
-        <w:t xml:space="preserve"> </w:t>
-      </w:r>
-      <w:proofErr w:type="spellStart"/>
-      <w:r>
-        <w:rPr>
-          <w:rFonts w:cstheme="minorHAnsi"/>
-        </w:rPr>
-        <w:t>WorkItemDecorator</w:t>
-      </w:r>
-      <w:proofErr w:type="spellEnd"/>
-      <w:r>
-        <w:rPr>
-          <w:rFonts w:cstheme="minorHAnsi"/>
-        </w:rPr>
-        <w:t xml:space="preserve"> </w:t>
+        <w:t xml:space="preserve"> WorkItemDecorator </w:t>
       </w:r>
       <w:r>
         <w:rPr>
@@ -1482,30 +1152,8 @@
         <w:rPr>
           <w:rFonts w:cstheme="minorHAnsi"/>
         </w:rPr>
-        <w:t xml:space="preserve"> </w:t>
-      </w:r>
-      <w:proofErr w:type="spellStart"/>
-      <w:r>
-        <w:rPr>
-          <w:rFonts w:cstheme="minorHAnsi"/>
-        </w:rPr>
-        <w:t>SafetyCheckDecorator</w:t>
-      </w:r>
-      <w:proofErr w:type="spellEnd"/>
-      <w:r>
-        <w:rPr>
-          <w:rFonts w:cstheme="minorHAnsi"/>
-        </w:rPr>
-        <w:t xml:space="preserve">, </w:t>
-      </w:r>
-      <w:proofErr w:type="spellStart"/>
-      <w:r>
-        <w:rPr>
-          <w:rFonts w:cstheme="minorHAnsi"/>
-        </w:rPr>
-        <w:t>EquipmentCheckDecorator</w:t>
-      </w:r>
-      <w:proofErr w:type="spellEnd"/>
+        <w:t xml:space="preserve"> SafetyCheckDecorator, EquipmentCheckDecorator</w:t>
+      </w:r>
     </w:p>
     <w:p>
       <w:pPr>
@@ -1543,45 +1191,55 @@
           <w:b/>
           <w:i/>
         </w:rPr>
-        <w:t xml:space="preserve">Why use </w:t>
-      </w:r>
-      <w:proofErr w:type="spellStart"/>
+        <w:t>Why use WorkItem?</w:t>
+      </w:r>
+      <w:r>
+        <w:rPr>
+          <w:rFonts w:cstheme="minorHAnsi"/>
+        </w:rPr>
+        <w:t xml:space="preserve"> WorkItem provides a common abstraction for both individual production tasks and groups of work. This allows the Composite pattern to treat individual and grouped work uniformly.</w:t>
+      </w:r>
+    </w:p>
+    <w:p>
+      <w:pPr>
+        <w:rPr>
+          <w:rFonts w:cstheme="minorHAnsi"/>
+        </w:rPr>
+      </w:pPr>
       <w:r>
         <w:rPr>
           <w:rFonts w:cstheme="minorHAnsi"/>
           <w:b/>
           <w:i/>
         </w:rPr>
-        <w:t>WorkItem</w:t>
-      </w:r>
-      <w:proofErr w:type="spellEnd"/>
+        <w:t>Why use WorkGroup?</w:t>
+      </w:r>
+      <w:r>
+        <w:rPr>
+          <w:rFonts w:cstheme="minorHAnsi"/>
+        </w:rPr>
+        <w:t xml:space="preserve"> Film production naturally consists of recursively nested groups. WorkGroup allows a group to contain other WorkItems, creating the required hierarchical structure.</w:t>
+      </w:r>
+    </w:p>
+    <w:p>
+      <w:pPr>
+        <w:rPr>
+          <w:rFonts w:cstheme="minorHAnsi"/>
+        </w:rPr>
+      </w:pPr>
       <w:r>
         <w:rPr>
           <w:rFonts w:cstheme="minorHAnsi"/>
           <w:b/>
           <w:i/>
         </w:rPr>
-        <w:t>?</w:t>
-      </w:r>
-      <w:r>
-        <w:rPr>
-          <w:rFonts w:cstheme="minorHAnsi"/>
-        </w:rPr>
-        <w:t xml:space="preserve"> </w:t>
-      </w:r>
-      <w:proofErr w:type="spellStart"/>
-      <w:r>
-        <w:rPr>
-          <w:rFonts w:cstheme="minorHAnsi"/>
-        </w:rPr>
-        <w:t>WorkItem</w:t>
-      </w:r>
-      <w:proofErr w:type="spellEnd"/>
-      <w:r>
-        <w:rPr>
-          <w:rFonts w:cstheme="minorHAnsi"/>
-        </w:rPr>
-        <w:t xml:space="preserve"> provides a common abstraction for both individual production tasks and groups of work. This allows the Composite pattern to treat individual and grouped work uniformly.</w:t>
+        <w:t>Why use ProductionPhase and Scene?</w:t>
+      </w:r>
+      <w:r>
+        <w:rPr>
+          <w:rFonts w:cstheme="minorHAnsi"/>
+        </w:rPr>
+        <w:t xml:space="preserve"> These provide concrete domain meaning to the composite hierarchy instead of creating a generic tree with no connection to the film-production problem.</w:t>
       </w:r>
     </w:p>
     <w:p>
@@ -1596,59 +1254,62 @@
           <w:b/>
           <w:i/>
         </w:rPr>
-        <w:t xml:space="preserve">Why use </w:t>
-      </w:r>
-      <w:proofErr w:type="spellStart"/>
+        <w:t>Why use two iterators?</w:t>
+      </w:r>
+      <w:r>
+        <w:rPr>
+          <w:rFonts w:cstheme="minorHAnsi"/>
+        </w:rPr>
+        <w:t xml:space="preserve"> Different users may need different views of the same production. ProductionOrderIterator follows the production hierarchy, while PriorityIterator identifies the most </w:t>
+      </w:r>
+      <w:r>
+        <w:rPr>
+          <w:rFonts w:cstheme="minorHAnsi"/>
+        </w:rPr>
+        <w:lastRenderedPageBreak/>
+        <w:t>important tasks first. This gives the Iterator pattern a genuine purpose rather than simply replacing an STL loop.</w:t>
+      </w:r>
+    </w:p>
+    <w:p>
+      <w:pPr>
+        <w:rPr>
+          <w:rFonts w:cstheme="minorHAnsi"/>
+        </w:rPr>
+      </w:pPr>
       <w:r>
         <w:rPr>
           <w:rFonts w:cstheme="minorHAnsi"/>
           <w:b/>
           <w:i/>
         </w:rPr>
-        <w:t>WorkGroup</w:t>
-      </w:r>
-      <w:proofErr w:type="spellEnd"/>
+        <w:t>Why use State?</w:t>
+      </w:r>
+      <w:r>
+        <w:rPr>
+          <w:rFonts w:cstheme="minorHAnsi"/>
+        </w:rPr>
+        <w:t xml:space="preserve"> A production task naturally changes throughout its lifecycle. The State pattern lets a task behave differently when planned, in progress, blocked or completed, while also preventing invalid lifecycle transitions.</w:t>
+      </w:r>
+    </w:p>
+    <w:p>
+      <w:pPr>
+        <w:rPr>
+          <w:rFonts w:cstheme="minorHAnsi"/>
+        </w:rPr>
+      </w:pPr>
       <w:r>
         <w:rPr>
           <w:rFonts w:cstheme="minorHAnsi"/>
           <w:b/>
           <w:i/>
         </w:rPr>
-        <w:t>?</w:t>
-      </w:r>
-      <w:r>
-        <w:rPr>
-          <w:rFonts w:cstheme="minorHAnsi"/>
-        </w:rPr>
-        <w:t xml:space="preserve"> Film production naturally consists of recursively nested groups. </w:t>
-      </w:r>
-      <w:proofErr w:type="spellStart"/>
-      <w:r>
-        <w:rPr>
-          <w:rFonts w:cstheme="minorHAnsi"/>
-        </w:rPr>
-        <w:t>WorkGroup</w:t>
-      </w:r>
-      <w:proofErr w:type="spellEnd"/>
-      <w:r>
-        <w:rPr>
-          <w:rFonts w:cstheme="minorHAnsi"/>
-        </w:rPr>
-        <w:t xml:space="preserve"> allows a group to contain other </w:t>
-      </w:r>
-      <w:proofErr w:type="spellStart"/>
-      <w:r>
-        <w:rPr>
-          <w:rFonts w:cstheme="minorHAnsi"/>
-        </w:rPr>
-        <w:t>WorkItems</w:t>
-      </w:r>
-      <w:proofErr w:type="spellEnd"/>
-      <w:r>
-        <w:rPr>
-          <w:rFonts w:cstheme="minorHAnsi"/>
-        </w:rPr>
-        <w:t>, creating the required hierarchical structure.</w:t>
+        <w:t>Why use Decorator?</w:t>
+      </w:r>
+      <w:r>
+        <w:rPr>
+          <w:rFonts w:cstheme="minorHAnsi"/>
+        </w:rPr>
+        <w:t xml:space="preserve"> Some production tasks require additional responsibilities only in particular circumstances. Safety checks and equipment checks can therefore be added dynamically without modifying ProductionTask.</w:t>
       </w:r>
     </w:p>
     <w:p>
@@ -1663,279 +1324,366 @@
           <w:b/>
           <w:i/>
         </w:rPr>
-        <w:t xml:space="preserve">Why use </w:t>
-      </w:r>
-      <w:proofErr w:type="spellStart"/>
+        <w:t>Why are decorators non-owning?</w:t>
+      </w:r>
+      <w:r>
+        <w:rPr>
+          <w:rFonts w:cstheme="minorHAnsi"/>
+        </w:rPr>
+        <w:t xml:space="preserve"> The production hierarchy should have one clear owner for each work item. Making decorators non-owning prevents ownership conflicts and ensures that the hierarchy remains responsible for the lifetime of the underlying work item.</w:t>
+      </w:r>
+    </w:p>
+    <w:p>
+      <w:pPr>
+        <w:rPr>
+          <w:rFonts w:cstheme="minorHAnsi"/>
+        </w:rPr>
+      </w:pPr>
       <w:r>
         <w:rPr>
           <w:rFonts w:cstheme="minorHAnsi"/>
           <w:b/>
           <w:i/>
         </w:rPr>
-        <w:t>ProductionPhase</w:t>
-      </w:r>
-      <w:proofErr w:type="spellEnd"/>
+        <w:t>Why use composition for WorkGroup → WorkItem?</w:t>
+      </w:r>
+      <w:r>
+        <w:rPr>
+          <w:rFonts w:cstheme="minorHAnsi"/>
+        </w:rPr>
+        <w:t xml:space="preserve"> The group owns the work items within it. This gives the system a clear destruction policy and makes the recursive hierarchy straightforward to manage.</w:t>
+      </w:r>
+    </w:p>
+    <w:p>
+      <w:pPr>
+        <w:rPr>
+          <w:rFonts w:cstheme="minorHAnsi"/>
+        </w:rPr>
+      </w:pPr>
       <w:r>
         <w:rPr>
           <w:rFonts w:cstheme="minorHAnsi"/>
           <w:b/>
           <w:i/>
         </w:rPr>
-        <w:t xml:space="preserve"> and Scene?</w:t>
-      </w:r>
-      <w:r>
-        <w:rPr>
-          <w:rFonts w:cstheme="minorHAnsi"/>
-        </w:rPr>
-        <w:t xml:space="preserve"> These provide concrete domain meaning to the composite hierarchy instead of creating a generic tree with no connection to the film-production problem.</w:t>
-      </w:r>
-    </w:p>
-    <w:p>
-      <w:pPr>
-        <w:rPr>
-          <w:rFonts w:cstheme="minorHAnsi"/>
-        </w:rPr>
-      </w:pPr>
+        <w:t>How we keep the design relatively small?</w:t>
+      </w:r>
+      <w:r>
+        <w:rPr>
+          <w:rFonts w:cstheme="minorHAnsi"/>
+        </w:rPr>
+        <w:t xml:space="preserve"> Since we are advised to keep the design relatively small, we deliberately do not model cameras, budgets, contracts, crew members, costumes, etc. as separate systems. They can appear as the subject of tasks, but TaskForge's responsibility is </w:t>
+      </w:r>
       <w:r>
         <w:rPr>
           <w:rFonts w:cstheme="minorHAnsi"/>
           <w:b/>
-          <w:i/>
-        </w:rPr>
-        <w:t>Why use two iterators?</w:t>
-      </w:r>
-      <w:r>
-        <w:rPr>
-          <w:rFonts w:cstheme="minorHAnsi"/>
-        </w:rPr>
-        <w:t xml:space="preserve"> Different users may need different views of the same production. </w:t>
-      </w:r>
-      <w:proofErr w:type="spellStart"/>
-      <w:r>
-        <w:rPr>
-          <w:rFonts w:cstheme="minorHAnsi"/>
-        </w:rPr>
-        <w:t>ProductionOrderIterator</w:t>
-      </w:r>
-      <w:proofErr w:type="spellEnd"/>
-      <w:r>
-        <w:rPr>
-          <w:rFonts w:cstheme="minorHAnsi"/>
-        </w:rPr>
-        <w:t xml:space="preserve"> follows the production hierarchy, while </w:t>
-      </w:r>
-      <w:proofErr w:type="spellStart"/>
-      <w:r>
-        <w:rPr>
-          <w:rFonts w:cstheme="minorHAnsi"/>
-        </w:rPr>
-        <w:t>PriorityIterator</w:t>
-      </w:r>
-      <w:proofErr w:type="spellEnd"/>
-      <w:r>
-        <w:rPr>
-          <w:rFonts w:cstheme="minorHAnsi"/>
-        </w:rPr>
-        <w:t xml:space="preserve"> identifies the most </w:t>
-      </w:r>
-      <w:r>
-        <w:rPr>
-          <w:rFonts w:cstheme="minorHAnsi"/>
-        </w:rPr>
+        </w:rPr>
+        <w:t>managing the hierarchical work itself.</w:t>
+      </w:r>
+    </w:p>
+    <w:p>
+      <w:pPr>
+        <w:rPr>
+          <w:rFonts w:cstheme="minorHAnsi"/>
+        </w:rPr>
+      </w:pPr>
+    </w:p>
+    <w:p>
+      <w:pPr>
+        <w:pStyle w:val="Heading1"/>
+      </w:pPr>
+      <w:r>
+        <w:br w:type="page"/>
+      </w:r>
+      <w:r>
         <w:lastRenderedPageBreak/>
-        <w:t>important tasks first. This gives the Iterator pattern a genuine purpose rather than simply replacing an STL loop.</w:t>
-      </w:r>
-    </w:p>
-    <w:p>
-      <w:pPr>
-        <w:rPr>
-          <w:rFonts w:cstheme="minorHAnsi"/>
-        </w:rPr>
-      </w:pPr>
-      <w:r>
-        <w:rPr>
-          <w:rFonts w:cstheme="minorHAnsi"/>
-          <w:b/>
-          <w:i/>
-        </w:rPr>
-        <w:t>Why use State?</w:t>
-      </w:r>
-      <w:r>
-        <w:rPr>
-          <w:rFonts w:cstheme="minorHAnsi"/>
-        </w:rPr>
-        <w:t xml:space="preserve"> A production task naturally changes throughout its lifecycle. The State pattern lets a task behave differently when planned, in progress, blocked or completed, while also preventing invalid lifecycle transitions.</w:t>
-      </w:r>
-    </w:p>
-    <w:p>
-      <w:pPr>
-        <w:rPr>
-          <w:rFonts w:cstheme="minorHAnsi"/>
-        </w:rPr>
-      </w:pPr>
-      <w:r>
-        <w:rPr>
-          <w:rFonts w:cstheme="minorHAnsi"/>
-          <w:b/>
-          <w:i/>
-        </w:rPr>
-        <w:t>Why use Decorator?</w:t>
-      </w:r>
-      <w:r>
-        <w:rPr>
-          <w:rFonts w:cstheme="minorHAnsi"/>
-        </w:rPr>
-        <w:t xml:space="preserve"> Some production tasks require additional responsibilities only in particular circumstances. Safety checks and equipment checks can therefore be added dynamically without modifying </w:t>
-      </w:r>
-      <w:proofErr w:type="spellStart"/>
-      <w:r>
-        <w:rPr>
-          <w:rFonts w:cstheme="minorHAnsi"/>
-        </w:rPr>
-        <w:t>ProductionTask</w:t>
-      </w:r>
-      <w:proofErr w:type="spellEnd"/>
-      <w:r>
-        <w:rPr>
-          <w:rFonts w:cstheme="minorHAnsi"/>
-        </w:rPr>
-        <w:t>.</w:t>
-      </w:r>
-    </w:p>
-    <w:p>
-      <w:pPr>
-        <w:rPr>
-          <w:rFonts w:cstheme="minorHAnsi"/>
-        </w:rPr>
-      </w:pPr>
-      <w:r>
-        <w:rPr>
-          <w:rFonts w:cstheme="minorHAnsi"/>
-          <w:b/>
-          <w:i/>
-        </w:rPr>
-        <w:t>Why are decorators non-owning?</w:t>
-      </w:r>
-      <w:r>
-        <w:rPr>
-          <w:rFonts w:cstheme="minorHAnsi"/>
-        </w:rPr>
-        <w:t xml:space="preserve"> The production hierarchy should have one clear owner for each work item. Making decorators non-owning prevents ownership conflicts and ensures that the hierarchy remains responsible for the lifetime of the underlying work item.</w:t>
-      </w:r>
-    </w:p>
-    <w:p>
-      <w:pPr>
-        <w:rPr>
-          <w:rFonts w:cstheme="minorHAnsi"/>
-        </w:rPr>
-      </w:pPr>
-      <w:r>
-        <w:rPr>
-          <w:rFonts w:cstheme="minorHAnsi"/>
-          <w:b/>
-          <w:i/>
-        </w:rPr>
-        <w:t xml:space="preserve">Why use composition for </w:t>
-      </w:r>
-      <w:proofErr w:type="spellStart"/>
-      <w:r>
-        <w:rPr>
-          <w:rFonts w:cstheme="minorHAnsi"/>
-          <w:b/>
-          <w:i/>
-        </w:rPr>
-        <w:t>WorkGroup</w:t>
-      </w:r>
-      <w:proofErr w:type="spellEnd"/>
-      <w:r>
-        <w:rPr>
-          <w:rFonts w:cstheme="minorHAnsi"/>
-          <w:b/>
-          <w:i/>
-        </w:rPr>
-        <w:t xml:space="preserve"> → </w:t>
-      </w:r>
-      <w:proofErr w:type="spellStart"/>
-      <w:r>
-        <w:rPr>
-          <w:rFonts w:cstheme="minorHAnsi"/>
-          <w:b/>
-          <w:i/>
-        </w:rPr>
-        <w:t>WorkItem</w:t>
-      </w:r>
-      <w:proofErr w:type="spellEnd"/>
-      <w:r>
-        <w:rPr>
-          <w:rFonts w:cstheme="minorHAnsi"/>
-          <w:b/>
-          <w:i/>
-        </w:rPr>
-        <w:t>?</w:t>
-      </w:r>
-      <w:r>
-        <w:rPr>
-          <w:rFonts w:cstheme="minorHAnsi"/>
-        </w:rPr>
-        <w:t xml:space="preserve"> The group owns the work items within it. This gives the system a clear destruction policy and makes the recursive hierarchy straightforward to manage.</w:t>
-      </w:r>
-    </w:p>
-    <w:p>
-      <w:pPr>
-        <w:rPr>
-          <w:rFonts w:cstheme="minorHAnsi"/>
-        </w:rPr>
-      </w:pPr>
-      <w:r>
-        <w:rPr>
-          <w:rFonts w:cstheme="minorHAnsi"/>
-          <w:b/>
-          <w:i/>
-        </w:rPr>
-        <w:t>How we keep the design relatively small?</w:t>
-      </w:r>
-      <w:r>
-        <w:rPr>
-          <w:rFonts w:cstheme="minorHAnsi"/>
-        </w:rPr>
-        <w:t xml:space="preserve"> Since we are advised to keep the design relatively small, we deliberately do not model cameras, budgets, contracts, crew members, costumes, etc. as separate systems. They can appear as the subject of tasks, but </w:t>
-      </w:r>
-      <w:proofErr w:type="spellStart"/>
-      <w:r>
-        <w:rPr>
-          <w:rFonts w:cstheme="minorHAnsi"/>
-        </w:rPr>
-        <w:t>TaskForge's</w:t>
-      </w:r>
-      <w:proofErr w:type="spellEnd"/>
-      <w:r>
-        <w:rPr>
-          <w:rFonts w:cstheme="minorHAnsi"/>
-        </w:rPr>
-        <w:t xml:space="preserve"> responsibility is </w:t>
-      </w:r>
-      <w:r>
-        <w:rPr>
-          <w:rFonts w:cstheme="minorHAnsi"/>
-          <w:b/>
-        </w:rPr>
-        <w:t>managing the hierarchical work itself.</w:t>
-      </w:r>
-    </w:p>
-    <w:p>
-      <w:pPr>
-        <w:rPr>
-          <w:rFonts w:cstheme="minorHAnsi"/>
-        </w:rPr>
-      </w:pPr>
+        <w:t>Task 4</w:t>
+      </w:r>
+    </w:p>
+    <w:p/>
+    <w:p>
+      <w:r>
+        <w:t>Object diagram representing FimProduction hierarchy and decorator wrapping after the execution of Scenario 2 in main.cpp</w:t>
+      </w:r>
+    </w:p>
+    <w:p>
+      <w:r>
+        <w:rPr>
+          <w:noProof/>
+        </w:rPr>
+        <w:drawing>
+          <wp:inline distT="0" distB="0" distL="0" distR="0" wp14:anchorId="62C5B5E4" wp14:editId="513F3E53">
+            <wp:extent cx="5943600" cy="5231765"/>
+            <wp:effectExtent l="0" t="0" r="0" b="6985"/>
+            <wp:docPr id="1495146808" name="Picture 1"/>
+            <wp:cNvGraphicFramePr>
+              <a:graphicFrameLocks xmlns:a="http://schemas.openxmlformats.org/drawingml/2006/main" noChangeAspect="1"/>
+            </wp:cNvGraphicFramePr>
+            <a:graphic xmlns:a="http://schemas.openxmlformats.org/drawingml/2006/main">
+              <a:graphicData uri="http://schemas.openxmlformats.org/drawingml/2006/picture">
+                <pic:pic xmlns:pic="http://schemas.openxmlformats.org/drawingml/2006/picture">
+                  <pic:nvPicPr>
+                    <pic:cNvPr id="1495146808" name="Picture 1495146808"/>
+                    <pic:cNvPicPr/>
+                  </pic:nvPicPr>
+                  <pic:blipFill>
+                    <a:blip r:embed="rId7" cstate="print">
+                      <a:extLst>
+                        <a:ext uri="{28A0092B-C50C-407E-A947-70E740481C1C}">
+                          <a14:useLocalDpi xmlns:a14="http://schemas.microsoft.com/office/drawing/2010/main" val="0"/>
+                        </a:ext>
+                      </a:extLst>
+                    </a:blip>
+                    <a:stretch>
+                      <a:fillRect/>
+                    </a:stretch>
+                  </pic:blipFill>
+                  <pic:spPr>
+                    <a:xfrm>
+                      <a:off x="0" y="0"/>
+                      <a:ext cx="5943600" cy="5231765"/>
+                    </a:xfrm>
+                    <a:prstGeom prst="rect">
+                      <a:avLst/>
+                    </a:prstGeom>
+                  </pic:spPr>
+                </pic:pic>
+              </a:graphicData>
+            </a:graphic>
+          </wp:inline>
+        </w:drawing>
+      </w:r>
+    </w:p>
+    <w:p/>
+    <w:p/>
+    <w:p/>
+    <w:p/>
+    <w:p/>
+    <w:p/>
+    <w:p>
+      <w:r>
+        <w:lastRenderedPageBreak/>
+        <w:t>State diagram representing states of a productionTask</w:t>
+      </w:r>
+    </w:p>
+    <w:p>
+      <w:r>
+        <w:rPr>
+          <w:noProof/>
+        </w:rPr>
+        <w:drawing>
+          <wp:inline distT="0" distB="0" distL="0" distR="0" wp14:anchorId="3A2F85FC" wp14:editId="312771A3">
+            <wp:extent cx="4857750" cy="2936695"/>
+            <wp:effectExtent l="0" t="0" r="0" b="0"/>
+            <wp:docPr id="545004699" name="Picture 2"/>
+            <wp:cNvGraphicFramePr>
+              <a:graphicFrameLocks xmlns:a="http://schemas.openxmlformats.org/drawingml/2006/main" noChangeAspect="1"/>
+            </wp:cNvGraphicFramePr>
+            <a:graphic xmlns:a="http://schemas.openxmlformats.org/drawingml/2006/main">
+              <a:graphicData uri="http://schemas.openxmlformats.org/drawingml/2006/picture">
+                <pic:pic xmlns:pic="http://schemas.openxmlformats.org/drawingml/2006/picture">
+                  <pic:nvPicPr>
+                    <pic:cNvPr id="545004699" name="Picture 545004699"/>
+                    <pic:cNvPicPr/>
+                  </pic:nvPicPr>
+                  <pic:blipFill>
+                    <a:blip r:embed="rId8" cstate="print">
+                      <a:extLst>
+                        <a:ext uri="{28A0092B-C50C-407E-A947-70E740481C1C}">
+                          <a14:useLocalDpi xmlns:a14="http://schemas.microsoft.com/office/drawing/2010/main" val="0"/>
+                        </a:ext>
+                      </a:extLst>
+                    </a:blip>
+                    <a:stretch>
+                      <a:fillRect/>
+                    </a:stretch>
+                  </pic:blipFill>
+                  <pic:spPr>
+                    <a:xfrm>
+                      <a:off x="0" y="0"/>
+                      <a:ext cx="4862682" cy="2939676"/>
+                    </a:xfrm>
+                    <a:prstGeom prst="rect">
+                      <a:avLst/>
+                    </a:prstGeom>
+                  </pic:spPr>
+                </pic:pic>
+              </a:graphicData>
+            </a:graphic>
+          </wp:inline>
+        </w:drawing>
+      </w:r>
+    </w:p>
+    <w:p/>
+    <w:p>
+      <w:r>
+        <w:t>Activity diagram 1 representing the flow of activities following a disruption</w:t>
+      </w:r>
+    </w:p>
+    <w:p>
+      <w:r>
+        <w:rPr>
+          <w:noProof/>
+        </w:rPr>
+        <w:drawing>
+          <wp:inline distT="0" distB="0" distL="0" distR="0" wp14:anchorId="54F6E976" wp14:editId="4E230945">
+            <wp:extent cx="2972306" cy="3871913"/>
+            <wp:effectExtent l="0" t="0" r="0" b="0"/>
+            <wp:docPr id="1911188425" name="Picture 3"/>
+            <wp:cNvGraphicFramePr>
+              <a:graphicFrameLocks xmlns:a="http://schemas.openxmlformats.org/drawingml/2006/main" noChangeAspect="1"/>
+            </wp:cNvGraphicFramePr>
+            <a:graphic xmlns:a="http://schemas.openxmlformats.org/drawingml/2006/main">
+              <a:graphicData uri="http://schemas.openxmlformats.org/drawingml/2006/picture">
+                <pic:pic xmlns:pic="http://schemas.openxmlformats.org/drawingml/2006/picture">
+                  <pic:nvPicPr>
+                    <pic:cNvPr id="1911188425" name="Picture 1911188425"/>
+                    <pic:cNvPicPr/>
+                  </pic:nvPicPr>
+                  <pic:blipFill>
+                    <a:blip r:embed="rId9" cstate="print">
+                      <a:extLst>
+                        <a:ext uri="{28A0092B-C50C-407E-A947-70E740481C1C}">
+                          <a14:useLocalDpi xmlns:a14="http://schemas.microsoft.com/office/drawing/2010/main" val="0"/>
+                        </a:ext>
+                      </a:extLst>
+                    </a:blip>
+                    <a:stretch>
+                      <a:fillRect/>
+                    </a:stretch>
+                  </pic:blipFill>
+                  <pic:spPr>
+                    <a:xfrm>
+                      <a:off x="0" y="0"/>
+                      <a:ext cx="2977115" cy="3878177"/>
+                    </a:xfrm>
+                    <a:prstGeom prst="rect">
+                      <a:avLst/>
+                    </a:prstGeom>
+                  </pic:spPr>
+                </pic:pic>
+              </a:graphicData>
+            </a:graphic>
+          </wp:inline>
+        </w:drawing>
+      </w:r>
+    </w:p>
+    <w:p/>
+    <w:p>
+      <w:r>
+        <w:lastRenderedPageBreak/>
+        <w:t>Activity diagram 2 representing the flow of the Iterator class with productionTask</w:t>
+      </w:r>
+    </w:p>
+    <w:p>
+      <w:r>
+        <w:rPr>
+          <w:noProof/>
+        </w:rPr>
+        <w:drawing>
+          <wp:inline distT="0" distB="0" distL="0" distR="0" wp14:anchorId="115AE519" wp14:editId="09604AD2">
+            <wp:extent cx="2949389" cy="3867150"/>
+            <wp:effectExtent l="0" t="0" r="3810" b="0"/>
+            <wp:docPr id="1805496684" name="Picture 4"/>
+            <wp:cNvGraphicFramePr>
+              <a:graphicFrameLocks xmlns:a="http://schemas.openxmlformats.org/drawingml/2006/main" noChangeAspect="1"/>
+            </wp:cNvGraphicFramePr>
+            <a:graphic xmlns:a="http://schemas.openxmlformats.org/drawingml/2006/main">
+              <a:graphicData uri="http://schemas.openxmlformats.org/drawingml/2006/picture">
+                <pic:pic xmlns:pic="http://schemas.openxmlformats.org/drawingml/2006/picture">
+                  <pic:nvPicPr>
+                    <pic:cNvPr id="1805496684" name="Picture 1805496684"/>
+                    <pic:cNvPicPr/>
+                  </pic:nvPicPr>
+                  <pic:blipFill>
+                    <a:blip r:embed="rId10" cstate="print">
+                      <a:extLst>
+                        <a:ext uri="{28A0092B-C50C-407E-A947-70E740481C1C}">
+                          <a14:useLocalDpi xmlns:a14="http://schemas.microsoft.com/office/drawing/2010/main" val="0"/>
+                        </a:ext>
+                      </a:extLst>
+                    </a:blip>
+                    <a:stretch>
+                      <a:fillRect/>
+                    </a:stretch>
+                  </pic:blipFill>
+                  <pic:spPr>
+                    <a:xfrm>
+                      <a:off x="0" y="0"/>
+                      <a:ext cx="2959867" cy="3880888"/>
+                    </a:xfrm>
+                    <a:prstGeom prst="rect">
+                      <a:avLst/>
+                    </a:prstGeom>
+                  </pic:spPr>
+                </pic:pic>
+              </a:graphicData>
+            </a:graphic>
+          </wp:inline>
+        </w:drawing>
+      </w:r>
+    </w:p>
+    <w:p>
+      <w:r>
+        <w:t>Activity diagram representing the flow of states in productionTask</w:t>
+      </w:r>
+    </w:p>
+    <w:p>
+      <w:r>
+        <w:rPr>
+          <w:noProof/>
+        </w:rPr>
+        <w:drawing>
+          <wp:inline distT="0" distB="0" distL="0" distR="0" wp14:anchorId="2C05F1AA" wp14:editId="6CD02D21">
+            <wp:extent cx="2696950" cy="3543300"/>
+            <wp:effectExtent l="0" t="0" r="8255" b="0"/>
+            <wp:docPr id="1889837983" name="Picture 5"/>
+            <wp:cNvGraphicFramePr>
+              <a:graphicFrameLocks xmlns:a="http://schemas.openxmlformats.org/drawingml/2006/main" noChangeAspect="1"/>
+            </wp:cNvGraphicFramePr>
+            <a:graphic xmlns:a="http://schemas.openxmlformats.org/drawingml/2006/main">
+              <a:graphicData uri="http://schemas.openxmlformats.org/drawingml/2006/picture">
+                <pic:pic xmlns:pic="http://schemas.openxmlformats.org/drawingml/2006/picture">
+                  <pic:nvPicPr>
+                    <pic:cNvPr id="1889837983" name="Picture 1889837983"/>
+                    <pic:cNvPicPr/>
+                  </pic:nvPicPr>
+                  <pic:blipFill>
+                    <a:blip r:embed="rId11" cstate="print">
+                      <a:extLst>
+                        <a:ext uri="{28A0092B-C50C-407E-A947-70E740481C1C}">
+                          <a14:useLocalDpi xmlns:a14="http://schemas.microsoft.com/office/drawing/2010/main" val="0"/>
+                        </a:ext>
+                      </a:extLst>
+                    </a:blip>
+                    <a:stretch>
+                      <a:fillRect/>
+                    </a:stretch>
+                  </pic:blipFill>
+                  <pic:spPr>
+                    <a:xfrm>
+                      <a:off x="0" y="0"/>
+                      <a:ext cx="2703193" cy="3551502"/>
+                    </a:xfrm>
+                    <a:prstGeom prst="rect">
+                      <a:avLst/>
+                    </a:prstGeom>
+                  </pic:spPr>
+                </pic:pic>
+              </a:graphicData>
+            </a:graphic>
+          </wp:inline>
+        </w:drawing>
+      </w:r>
+      <w:r>
+        <w:br w:type="page"/>
+      </w:r>
     </w:p>
     <w:p>
       <w:pPr>
         <w:pStyle w:val="Heading1"/>
       </w:pPr>
-      <w:r>
-        <w:br w:type="page"/>
-      </w:r>
       <w:r>
         <w:lastRenderedPageBreak/>
         <w:t>Task 5</w:t>
@@ -1944,19 +1692,14 @@
     <w:p/>
     <w:p>
       <w:r>
-        <w:t xml:space="preserve">Using </w:t>
-      </w:r>
-      <w:proofErr w:type="spellStart"/>
-      <w:r>
-        <w:t>gdb</w:t>
-      </w:r>
-      <w:proofErr w:type="spellEnd"/>
-      <w:r>
-        <w:t xml:space="preserve"> while implementing:</w:t>
-      </w:r>
-    </w:p>
-    <w:p>
-      <w:r>
+        <w:t>Using gdb while implementing:</w:t>
+      </w:r>
+    </w:p>
+    <w:p>
+      <w:r>
+        <w:rPr>
+          <w:noProof/>
+        </w:rPr>
         <w:drawing>
           <wp:inline distT="0" distB="0" distL="0" distR="0" wp14:anchorId="6E469648" wp14:editId="77D132ED">
             <wp:extent cx="4095345" cy="3958027"/>
@@ -1973,7 +1716,7 @@
                     <pic:cNvPicPr/>
                   </pic:nvPicPr>
                   <pic:blipFill>
-                    <a:blip r:embed="rId7"/>
+                    <a:blip r:embed="rId12"/>
                     <a:stretch>
                       <a:fillRect/>
                     </a:stretch>
@@ -1996,6 +1739,9 @@
     </w:p>
     <w:p>
       <w:r>
+        <w:rPr>
+          <w:noProof/>
+        </w:rPr>
         <w:drawing>
           <wp:inline distT="0" distB="0" distL="0" distR="0" wp14:anchorId="3F4A87A9" wp14:editId="0F482C6A">
             <wp:extent cx="4133852" cy="2898842"/>
@@ -2012,7 +1758,7 @@
                     <pic:cNvPicPr/>
                   </pic:nvPicPr>
                   <pic:blipFill>
-                    <a:blip r:embed="rId8"/>
+                    <a:blip r:embed="rId13"/>
                     <a:stretch>
                       <a:fillRect/>
                     </a:stretch>
@@ -2041,13 +1787,8 @@
       </w:r>
     </w:p>
     <w:p>
-      <w:proofErr w:type="spellStart"/>
-      <w:r>
-        <w:t>taskforge</w:t>
-      </w:r>
-      <w:proofErr w:type="spellEnd"/>
-      <w:r>
-        <w:t xml:space="preserve"> builds cleanly but crashes with a segmentation fault at program shutdown, after printing all of Scenario 2's output. A subtler tell shows up earlier too: the "</w:t>
+      <w:r>
+        <w:t>taskforge builds cleanly but crashes with a segmentation fault at program shutdown, after printing all of Scenario 2's output. A subtler tell shows up earlier too: the "</w:t>
       </w:r>
       <w:r>
         <w:t>new</w:t>
@@ -2062,7 +1803,7 @@
           <w:noProof/>
         </w:rPr>
         <w:drawing>
-          <wp:inline distT="0" distB="0" distL="0" distR="0" wp14:anchorId="5E86CCC4" wp14:editId="0AC3E913">
+          <wp:inline distT="0" distB="0" distL="0" distR="0" wp14:anchorId="5E86CCC4" wp14:editId="2DCB56DD">
             <wp:extent cx="3910013" cy="1867231"/>
             <wp:effectExtent l="0" t="0" r="0" b="0"/>
             <wp:docPr id="917216580" name="Picture 1"/>
@@ -2077,7 +1818,7 @@
                     <pic:cNvPicPr/>
                   </pic:nvPicPr>
                   <pic:blipFill>
-                    <a:blip r:embed="rId9" cstate="print">
+                    <a:blip r:embed="rId14" cstate="print">
                       <a:extLst>
                         <a:ext uri="{28A0092B-C50C-407E-A947-70E740481C1C}">
                           <a14:useLocalDpi xmlns:a14="http://schemas.microsoft.com/office/drawing/2010/main" val="0"/>
@@ -2106,68 +1847,14 @@
     </w:p>
     <w:p>
       <w:r>
-        <w:t>In the weather-disruption s</w:t>
-      </w:r>
-      <w:r>
-        <w:t>cenario</w:t>
-      </w:r>
-      <w:r>
-        <w:t xml:space="preserve">, the task added Set Up Lighting to </w:t>
-      </w:r>
-      <w:proofErr w:type="spellStart"/>
-      <w:r>
-        <w:t>warehouseClimax</w:t>
-      </w:r>
-      <w:proofErr w:type="spellEnd"/>
-      <w:r>
-        <w:t xml:space="preserve"> but never called </w:t>
-      </w:r>
-      <w:proofErr w:type="spellStart"/>
-      <w:r>
-        <w:t>harborOpening</w:t>
-      </w:r>
-      <w:proofErr w:type="spellEnd"/>
-      <w:r>
-        <w:t xml:space="preserve">-&gt;remove(...) first. The same </w:t>
-      </w:r>
-      <w:proofErr w:type="spellStart"/>
-      <w:r>
-        <w:t>ProductionTask</w:t>
-      </w:r>
-      <w:proofErr w:type="spellEnd"/>
-      <w:r>
-        <w:t xml:space="preserve">* was now sitting in two </w:t>
-      </w:r>
-      <w:proofErr w:type="spellStart"/>
-      <w:proofErr w:type="gramStart"/>
-      <w:r>
-        <w:t>WorkGroup</w:t>
-      </w:r>
-      <w:proofErr w:type="spellEnd"/>
-      <w:r>
-        <w:t>::children</w:t>
-      </w:r>
-      <w:proofErr w:type="gramEnd"/>
-      <w:r>
-        <w:t xml:space="preserve"> vectors. Both are </w:t>
-      </w:r>
-      <w:proofErr w:type="spellStart"/>
-      <w:r>
-        <w:t>WorkGroup</w:t>
-      </w:r>
-      <w:proofErr w:type="spellEnd"/>
-      <w:r>
-        <w:t>, both own their children, and both delete every child in their destructor</w:t>
-      </w:r>
-      <w:r>
-        <w:t>. T</w:t>
-      </w:r>
-      <w:r>
-        <w:t>he pointer gets deleted twice.</w:t>
-      </w:r>
-    </w:p>
-    <w:p>
-      <w:r>
+        <w:t>In the weather-disruption scenario, the task added Set Up Lighting to warehouseClimax but never called harborOpening-&gt;remove(...) first. The same ProductionTask* was now in two WorkGroup::children vectors. Both are WorkGroup, both own their children, and both delete every child in their destructor. The pointer gets deleted twice.</w:t>
+      </w:r>
+    </w:p>
+    <w:p>
+      <w:r>
+        <w:rPr>
+          <w:noProof/>
+        </w:rPr>
         <w:drawing>
           <wp:inline distT="0" distB="0" distL="0" distR="0" wp14:anchorId="40783450" wp14:editId="5E7BB761">
             <wp:extent cx="4962561" cy="619130"/>
@@ -2184,7 +1871,7 @@
                     <pic:cNvPicPr/>
                   </pic:nvPicPr>
                   <pic:blipFill>
-                    <a:blip r:embed="rId10"/>
+                    <a:blip r:embed="rId15"/>
                     <a:stretch>
                       <a:fillRect/>
                     </a:stretch>
@@ -2207,6 +1894,9 @@
     </w:p>
     <w:p>
       <w:r>
+        <w:rPr>
+          <w:noProof/>
+        </w:rPr>
         <w:drawing>
           <wp:inline distT="0" distB="0" distL="0" distR="0" wp14:anchorId="39354427" wp14:editId="26AE82C2">
             <wp:extent cx="4784245" cy="3569970"/>
@@ -2223,7 +1913,7 @@
                     <pic:cNvPicPr/>
                   </pic:nvPicPr>
                   <pic:blipFill>
-                    <a:blip r:embed="rId11"/>
+                    <a:blip r:embed="rId16"/>
                     <a:stretch>
                       <a:fillRect/>
                     </a:stretch>
@@ -2256,76 +1946,24 @@
           <w:rFonts w:ascii="Courier New" w:hAnsi="Courier New" w:cs="Courier New"/>
         </w:rPr>
       </w:pPr>
-      <w:proofErr w:type="spellStart"/>
-      <w:proofErr w:type="gramStart"/>
       <w:r>
         <w:rPr>
           <w:rFonts w:ascii="Courier New" w:hAnsi="Courier New" w:cs="Courier New"/>
         </w:rPr>
-        <w:t>world.harborOpening</w:t>
-      </w:r>
-      <w:proofErr w:type="spellEnd"/>
-      <w:proofErr w:type="gramEnd"/>
-      <w:r>
+        <w:t>world.harborOpening-&gt;remove(world.setUpLighting);</w:t>
+      </w:r>
+    </w:p>
+    <w:p>
+      <w:pPr>
         <w:rPr>
           <w:rFonts w:ascii="Courier New" w:hAnsi="Courier New" w:cs="Courier New"/>
         </w:rPr>
-        <w:t>-&gt;remove(</w:t>
-      </w:r>
-      <w:proofErr w:type="spellStart"/>
-      <w:proofErr w:type="gramStart"/>
+      </w:pPr>
       <w:r>
         <w:rPr>
           <w:rFonts w:ascii="Courier New" w:hAnsi="Courier New" w:cs="Courier New"/>
         </w:rPr>
-        <w:t>world.setUpLighting</w:t>
-      </w:r>
-      <w:proofErr w:type="spellEnd"/>
-      <w:proofErr w:type="gramEnd"/>
-      <w:r>
-        <w:rPr>
-          <w:rFonts w:ascii="Courier New" w:hAnsi="Courier New" w:cs="Courier New"/>
-        </w:rPr>
-        <w:t>);</w:t>
-      </w:r>
-    </w:p>
-    <w:p>
-      <w:pPr>
-        <w:rPr>
-          <w:rFonts w:ascii="Courier New" w:hAnsi="Courier New" w:cs="Courier New"/>
-        </w:rPr>
-      </w:pPr>
-      <w:proofErr w:type="spellStart"/>
-      <w:proofErr w:type="gramStart"/>
-      <w:r>
-        <w:rPr>
-          <w:rFonts w:ascii="Courier New" w:hAnsi="Courier New" w:cs="Courier New"/>
-        </w:rPr>
-        <w:t>world.warehouseClimax</w:t>
-      </w:r>
-      <w:proofErr w:type="spellEnd"/>
-      <w:proofErr w:type="gramEnd"/>
-      <w:r>
-        <w:rPr>
-          <w:rFonts w:ascii="Courier New" w:hAnsi="Courier New" w:cs="Courier New"/>
-        </w:rPr>
-        <w:t>-&gt;add(</w:t>
-      </w:r>
-      <w:proofErr w:type="spellStart"/>
-      <w:proofErr w:type="gramStart"/>
-      <w:r>
-        <w:rPr>
-          <w:rFonts w:ascii="Courier New" w:hAnsi="Courier New" w:cs="Courier New"/>
-        </w:rPr>
-        <w:t>world.setUpLighting</w:t>
-      </w:r>
-      <w:proofErr w:type="spellEnd"/>
-      <w:proofErr w:type="gramEnd"/>
-      <w:r>
-        <w:rPr>
-          <w:rFonts w:ascii="Courier New" w:hAnsi="Courier New" w:cs="Courier New"/>
-        </w:rPr>
-        <w:t>);</w:t>
+        <w:t>world.warehouseClimax-&gt;add(world.setUpLighting);</w:t>
       </w:r>
     </w:p>
     <w:p>
@@ -2334,12 +1972,7 @@
       </w:r>
       <w:r>
         <w:br/>
-      </w:r>
-      <w:r>
-        <w:t>After the fix: exit code 0, Set Up Lighting appears exactly once everywhere</w:t>
-      </w:r>
-      <w:r>
-        <w:t xml:space="preserve">. </w:t>
+        <w:t xml:space="preserve">After the fix: exit code 0, Set Up Lighting appears exactly once everywhere. </w:t>
       </w:r>
     </w:p>
     <w:p/>
@@ -2350,6 +1983,9 @@
     </w:p>
     <w:p>
       <w:r>
+        <w:rPr>
+          <w:noProof/>
+        </w:rPr>
         <w:drawing>
           <wp:inline distT="0" distB="0" distL="0" distR="0" wp14:anchorId="3EE5421E" wp14:editId="4D9E63D6">
             <wp:extent cx="5943600" cy="1416685"/>
@@ -2366,7 +2002,7 @@
                     <pic:cNvPicPr/>
                   </pic:nvPicPr>
                   <pic:blipFill>
-                    <a:blip r:embed="rId12"/>
+                    <a:blip r:embed="rId17"/>
                     <a:stretch>
                       <a:fillRect/>
                     </a:stretch>
@@ -2391,7 +2027,7 @@
     <w:p/>
     <w:p/>
     <w:sectPr>
-      <w:headerReference w:type="default" r:id="rId13"/>
+      <w:headerReference w:type="default" r:id="rId18"/>
       <w:pgSz w:w="12240" w:h="15840"/>
       <w:pgMar w:top="1440" w:right="1440" w:bottom="1440" w:left="1440" w:header="720" w:footer="720" w:gutter="0"/>
       <w:cols w:space="720"/>
@@ -3331,6 +2967,7 @@
   <w:style w:type="character" w:default="1" w:styleId="DefaultParagraphFont">
     <w:name w:val="Default Paragraph Font"/>
     <w:uiPriority w:val="1"/>
+    <w:semiHidden/>
     <w:unhideWhenUsed/>
   </w:style>
   <w:style w:type="table" w:default="1" w:styleId="TableNormal">

</xml_diff>

<commit_message>
Added task 3 answers
</commit_message>
<xml_diff>
--- a/COS214_P4.docx
+++ b/COS214_P4.docx
@@ -56,8 +56,13 @@
       </w:r>
     </w:p>
     <w:p>
-      <w:r>
-        <w:t>TaskForge is a reusable work-processing system designed to manage the work involved in producing a film. Film production contains a large bo</w:t>
+      <w:proofErr w:type="spellStart"/>
+      <w:r>
+        <w:t>TaskForge</w:t>
+      </w:r>
+      <w:proofErr w:type="spellEnd"/>
+      <w:r>
+        <w:t xml:space="preserve"> is a reusable work-processing system designed to manage the work involved in producing a film. Film production contains a large bo</w:t>
       </w:r>
       <w:r>
         <w:t>dy of work that can be broken</w:t>
@@ -68,7 +73,15 @@
     </w:p>
     <w:p>
       <w:r>
-        <w:t>The problem TaskForge solves is the difficulty of organising, processing and monitoring this hierarchical body of work while allowing production staff to:</w:t>
+        <w:t xml:space="preserve">The problem </w:t>
+      </w:r>
+      <w:proofErr w:type="spellStart"/>
+      <w:r>
+        <w:t>TaskForge</w:t>
+      </w:r>
+      <w:proofErr w:type="spellEnd"/>
+      <w:r>
+        <w:t xml:space="preserve"> solves is the difficulty of organising, processing and monitoring this hierarchical body of work while allowing production staff to:</w:t>
       </w:r>
       <w:r>
         <w:t xml:space="preserve"> </w:t>
@@ -109,16 +122,37 @@
           <w:rStyle w:val="SubtleEmphasis"/>
         </w:rPr>
       </w:pPr>
+      <w:proofErr w:type="spellStart"/>
       <w:r>
         <w:rPr>
           <w:rStyle w:val="SubtleEmphasis"/>
         </w:rPr>
-        <w:t>TaskForge System Overview</w:t>
-      </w:r>
-    </w:p>
-    <w:p>
-      <w:r>
-        <w:t>TaskForge is a hierarchical work-processing system designed for managing the work involved in producing a film. A film production consists of many pieces of work that are organised into groups, such as production phases, scenes, and individual production tasks. TaskForge represents this work as a hierarchy in which both individual tasks and groups of tasks can be treated uniformly (composite DP).</w:t>
+        <w:t>TaskForge</w:t>
+      </w:r>
+      <w:proofErr w:type="spellEnd"/>
+      <w:r>
+        <w:rPr>
+          <w:rStyle w:val="SubtleEmphasis"/>
+        </w:rPr>
+        <w:t xml:space="preserve"> System Overview</w:t>
+      </w:r>
+    </w:p>
+    <w:p>
+      <w:proofErr w:type="spellStart"/>
+      <w:r>
+        <w:t>TaskForge</w:t>
+      </w:r>
+      <w:proofErr w:type="spellEnd"/>
+      <w:r>
+        <w:t xml:space="preserve"> is a hierarchical work-processing system designed for managing the work involved in producing a film. A film production consists of many pieces of work that are organised into groups, such as production phases, scenes, and individual production tasks. </w:t>
+      </w:r>
+      <w:proofErr w:type="spellStart"/>
+      <w:r>
+        <w:t>TaskForge</w:t>
+      </w:r>
+      <w:proofErr w:type="spellEnd"/>
+      <w:r>
+        <w:t xml:space="preserve"> represents this work as a hierarchy in which both individual tasks and groups of tasks can be treated uniformly (composite DP).</w:t>
       </w:r>
     </w:p>
     <w:p>
@@ -191,9 +225,22 @@
       </w:r>
     </w:p>
     <w:p>
+      <w:proofErr w:type="spellStart"/>
       <w:r>
         <w:lastRenderedPageBreak/>
-        <w:t>TaskForge also allows additional responsibilities to be added to work items at runtime. For example, a safety check or equipment check can be added to a filming task without modifying the original task. These responsibilities can be stacked, allowing a single task to have multiple additional requirements while remaining usable through the same WorkItem abstraction</w:t>
+        <w:t>TaskForge</w:t>
+      </w:r>
+      <w:proofErr w:type="spellEnd"/>
+      <w:r>
+        <w:t xml:space="preserve"> also allows additional responsibilities to be added to work items at runtime. For example, a safety check or equipment check can be added to a filming task without modifying the original task. These responsibilities can be stacked, allowing a single task to have multiple additional requirements while remaining usable through the same </w:t>
+      </w:r>
+      <w:proofErr w:type="spellStart"/>
+      <w:r>
+        <w:t>WorkItem</w:t>
+      </w:r>
+      <w:proofErr w:type="spellEnd"/>
+      <w:r>
+        <w:t xml:space="preserve"> abstraction</w:t>
       </w:r>
       <w:r>
         <w:t xml:space="preserve"> (Decorator DP)</w:t>
@@ -204,7 +251,15 @@
     </w:p>
     <w:p>
       <w:r>
-        <w:t xml:space="preserve">Finally, the production hierarchy can change while the system is running. For example, a task can be moved from one scene or production group to another. TaskForge uses a deliberate </w:t>
+        <w:t xml:space="preserve">Finally, the production hierarchy can change while the system is running. For example, a task can be moved from one scene or production group to another. </w:t>
+      </w:r>
+      <w:proofErr w:type="spellStart"/>
+      <w:r>
+        <w:t>TaskForge</w:t>
+      </w:r>
+      <w:proofErr w:type="spellEnd"/>
+      <w:r>
+        <w:t xml:space="preserve"> uses a deliberate </w:t>
       </w:r>
       <w:r>
         <w:rPr>
@@ -218,7 +273,15 @@
     </w:p>
     <w:p>
       <w:r>
-        <w:t>Overall, TaskForge provides a single system for organising, traversing, processing, monitoring, and dynamically modifying film-production work. The Composite, Iterator, State, and Decorator patterns work together as parts of this single workflow rather than as separate demonstrations of the patterns.</w:t>
+        <w:t xml:space="preserve">Overall, </w:t>
+      </w:r>
+      <w:proofErr w:type="spellStart"/>
+      <w:r>
+        <w:t>TaskForge</w:t>
+      </w:r>
+      <w:proofErr w:type="spellEnd"/>
+      <w:r>
+        <w:t xml:space="preserve"> provides a single system for organising, traversing, processing, monitoring, and dynamically modifying film-production work. The Composite, Iterator, State, and Decorator patterns work together as parts of this single workflow rather than as separate demonstrations of the patterns.</w:t>
       </w:r>
     </w:p>
     <w:p/>
@@ -246,7 +309,25 @@
           <w:rFonts w:eastAsiaTheme="minorEastAsia"/>
           <w:spacing w:val="15"/>
         </w:rPr>
-        <w:t>fication of the GoF participants</w:t>
+        <w:t xml:space="preserve">fication of the </w:t>
+      </w:r>
+      <w:proofErr w:type="spellStart"/>
+      <w:r>
+        <w:rPr>
+          <w:rStyle w:val="SubtleEmphasis"/>
+          <w:rFonts w:eastAsiaTheme="minorEastAsia"/>
+          <w:spacing w:val="15"/>
+        </w:rPr>
+        <w:t>GoF</w:t>
+      </w:r>
+      <w:proofErr w:type="spellEnd"/>
+      <w:r>
+        <w:rPr>
+          <w:rStyle w:val="SubtleEmphasis"/>
+          <w:rFonts w:eastAsiaTheme="minorEastAsia"/>
+          <w:spacing w:val="15"/>
+        </w:rPr>
+        <w:t xml:space="preserve"> participants</w:t>
       </w:r>
     </w:p>
     <w:p>
@@ -304,12 +385,14 @@
                 <w:b w:val="0"/>
               </w:rPr>
             </w:pPr>
+            <w:proofErr w:type="spellStart"/>
             <w:r>
               <w:rPr>
                 <w:b w:val="0"/>
               </w:rPr>
               <w:t>WorkItem</w:t>
             </w:r>
+            <w:proofErr w:type="spellEnd"/>
           </w:p>
         </w:tc>
         <w:tc>
@@ -355,9 +438,11 @@
             <w:pPr>
               <w:cnfStyle w:val="000000100000" w:firstRow="0" w:lastRow="0" w:firstColumn="0" w:lastColumn="0" w:oddVBand="0" w:evenVBand="0" w:oddHBand="1" w:evenHBand="0" w:firstRowFirstColumn="0" w:firstRowLastColumn="0" w:lastRowFirstColumn="0" w:lastRowLastColumn="0"/>
             </w:pPr>
+            <w:proofErr w:type="spellStart"/>
             <w:r>
               <w:t>WorkGroup</w:t>
             </w:r>
+            <w:proofErr w:type="spellEnd"/>
           </w:p>
         </w:tc>
         <w:tc>
@@ -369,8 +454,13 @@
               <w:cnfStyle w:val="000000100000" w:firstRow="0" w:lastRow="0" w:firstColumn="0" w:lastColumn="0" w:oddVBand="0" w:evenVBand="0" w:oddHBand="1" w:evenHBand="0" w:firstRowFirstColumn="0" w:firstRowLastColumn="0" w:lastRowFirstColumn="0" w:lastRowLastColumn="0"/>
             </w:pPr>
             <w:r>
-              <w:t>Represents a group that contains other WorkItems</w:t>
-            </w:r>
+              <w:t xml:space="preserve">Represents a group that contains other </w:t>
+            </w:r>
+            <w:proofErr w:type="spellStart"/>
+            <w:r>
+              <w:t>WorkItems</w:t>
+            </w:r>
+            <w:proofErr w:type="spellEnd"/>
           </w:p>
         </w:tc>
       </w:tr>
@@ -394,9 +484,11 @@
             <w:pPr>
               <w:cnfStyle w:val="000000000000" w:firstRow="0" w:lastRow="0" w:firstColumn="0" w:lastColumn="0" w:oddVBand="0" w:evenVBand="0" w:oddHBand="0" w:evenHBand="0" w:firstRowFirstColumn="0" w:firstRowLastColumn="0" w:lastRowFirstColumn="0" w:lastRowLastColumn="0"/>
             </w:pPr>
+            <w:proofErr w:type="spellStart"/>
             <w:r>
               <w:t>ProductionTask</w:t>
             </w:r>
+            <w:proofErr w:type="spellEnd"/>
           </w:p>
         </w:tc>
         <w:tc>
@@ -436,9 +528,11 @@
             <w:pPr>
               <w:cnfStyle w:val="000000100000" w:firstRow="0" w:lastRow="0" w:firstColumn="0" w:lastColumn="0" w:oddVBand="0" w:evenVBand="0" w:oddHBand="1" w:evenHBand="0" w:firstRowFirstColumn="0" w:firstRowLastColumn="0" w:lastRowFirstColumn="0" w:lastRowLastColumn="0"/>
             </w:pPr>
+            <w:proofErr w:type="spellStart"/>
             <w:r>
               <w:t>ProductionPhase</w:t>
             </w:r>
+            <w:proofErr w:type="spellEnd"/>
             <w:r>
               <w:t>(Pre-Production, production, post-production)</w:t>
             </w:r>
@@ -446,7 +540,39 @@
               <w:t>, Scene</w:t>
             </w:r>
             <w:r>
-              <w:t xml:space="preserve"> (OpeningScene, ClosingScene, ClimaxScene, postClimaxScene)</w:t>
+              <w:t xml:space="preserve"> (</w:t>
+            </w:r>
+            <w:proofErr w:type="spellStart"/>
+            <w:r>
+              <w:t>OpeningScene</w:t>
+            </w:r>
+            <w:proofErr w:type="spellEnd"/>
+            <w:r>
+              <w:t xml:space="preserve">, </w:t>
+            </w:r>
+            <w:proofErr w:type="spellStart"/>
+            <w:r>
+              <w:t>ClosingScene</w:t>
+            </w:r>
+            <w:proofErr w:type="spellEnd"/>
+            <w:r>
+              <w:t xml:space="preserve">, </w:t>
+            </w:r>
+            <w:proofErr w:type="spellStart"/>
+            <w:r>
+              <w:t>ClimaxScene</w:t>
+            </w:r>
+            <w:proofErr w:type="spellEnd"/>
+            <w:r>
+              <w:t xml:space="preserve">, </w:t>
+            </w:r>
+            <w:proofErr w:type="spellStart"/>
+            <w:r>
+              <w:t>postClimaxScene</w:t>
+            </w:r>
+            <w:proofErr w:type="spellEnd"/>
+            <w:r>
+              <w:t>)</w:t>
             </w:r>
           </w:p>
         </w:tc>
@@ -513,9 +639,11 @@
             <w:pPr>
               <w:cnfStyle w:val="100000000000" w:firstRow="1" w:lastRow="0" w:firstColumn="0" w:lastColumn="0" w:oddVBand="0" w:evenVBand="0" w:oddHBand="0" w:evenHBand="0" w:firstRowFirstColumn="0" w:firstRowLastColumn="0" w:lastRowFirstColumn="0" w:lastRowLastColumn="0"/>
             </w:pPr>
+            <w:proofErr w:type="spellStart"/>
             <w:r>
               <w:t>WorkIterator</w:t>
             </w:r>
+            <w:proofErr w:type="spellEnd"/>
           </w:p>
         </w:tc>
         <w:tc>
@@ -555,9 +683,11 @@
             <w:pPr>
               <w:cnfStyle w:val="000000100000" w:firstRow="0" w:lastRow="0" w:firstColumn="0" w:lastColumn="0" w:oddVBand="0" w:evenVBand="0" w:oddHBand="1" w:evenHBand="0" w:firstRowFirstColumn="0" w:firstRowLastColumn="0" w:lastRowFirstColumn="0" w:lastRowLastColumn="0"/>
             </w:pPr>
+            <w:proofErr w:type="spellStart"/>
             <w:r>
               <w:t>ProductionOrderIterator</w:t>
             </w:r>
+            <w:proofErr w:type="spellEnd"/>
           </w:p>
         </w:tc>
         <w:tc>
@@ -597,9 +727,11 @@
             <w:pPr>
               <w:cnfStyle w:val="000000000000" w:firstRow="0" w:lastRow="0" w:firstColumn="0" w:lastColumn="0" w:oddVBand="0" w:evenVBand="0" w:oddHBand="0" w:evenHBand="0" w:firstRowFirstColumn="0" w:firstRowLastColumn="0" w:lastRowFirstColumn="0" w:lastRowLastColumn="0"/>
             </w:pPr>
+            <w:proofErr w:type="spellStart"/>
             <w:r>
               <w:t>PriorityIterator</w:t>
             </w:r>
+            <w:proofErr w:type="spellEnd"/>
           </w:p>
         </w:tc>
         <w:tc>
@@ -639,9 +771,19 @@
             <w:pPr>
               <w:cnfStyle w:val="000000100000" w:firstRow="0" w:lastRow="0" w:firstColumn="0" w:lastColumn="0" w:oddVBand="0" w:evenVBand="0" w:oddHBand="1" w:evenHBand="0" w:firstRowFirstColumn="0" w:firstRowLastColumn="0" w:lastRowFirstColumn="0" w:lastRowLastColumn="0"/>
             </w:pPr>
-            <w:r>
-              <w:t>WorkItem/ WorkGroup</w:t>
-            </w:r>
+            <w:proofErr w:type="spellStart"/>
+            <w:r>
+              <w:t>WorkItem</w:t>
+            </w:r>
+            <w:proofErr w:type="spellEnd"/>
+            <w:r>
+              <w:t xml:space="preserve">/ </w:t>
+            </w:r>
+            <w:proofErr w:type="spellStart"/>
+            <w:r>
+              <w:t>WorkGroup</w:t>
+            </w:r>
+            <w:proofErr w:type="spellEnd"/>
           </w:p>
         </w:tc>
         <w:tc>
@@ -711,9 +853,11 @@
             <w:pPr>
               <w:cnfStyle w:val="100000000000" w:firstRow="1" w:lastRow="0" w:firstColumn="0" w:lastColumn="0" w:oddVBand="0" w:evenVBand="0" w:oddHBand="0" w:evenHBand="0" w:firstRowFirstColumn="0" w:firstRowLastColumn="0" w:lastRowFirstColumn="0" w:lastRowLastColumn="0"/>
             </w:pPr>
+            <w:proofErr w:type="spellStart"/>
             <w:r>
               <w:t>ProductionTask</w:t>
             </w:r>
+            <w:proofErr w:type="spellEnd"/>
           </w:p>
         </w:tc>
         <w:tc>
@@ -753,9 +897,11 @@
             <w:pPr>
               <w:cnfStyle w:val="000000100000" w:firstRow="0" w:lastRow="0" w:firstColumn="0" w:lastColumn="0" w:oddVBand="0" w:evenVBand="0" w:oddHBand="1" w:evenHBand="0" w:firstRowFirstColumn="0" w:firstRowLastColumn="0" w:lastRowFirstColumn="0" w:lastRowLastColumn="0"/>
             </w:pPr>
+            <w:proofErr w:type="spellStart"/>
             <w:r>
               <w:t>TaskState</w:t>
             </w:r>
+            <w:proofErr w:type="spellEnd"/>
           </w:p>
         </w:tc>
         <w:tc>
@@ -779,9 +925,11 @@
             <w:tcW w:w="3000" w:type="dxa"/>
           </w:tcPr>
           <w:p>
+            <w:proofErr w:type="spellStart"/>
             <w:r>
               <w:t>ConcreteState</w:t>
             </w:r>
+            <w:proofErr w:type="spellEnd"/>
           </w:p>
         </w:tc>
         <w:tc>
@@ -865,9 +1013,11 @@
             <w:pPr>
               <w:cnfStyle w:val="100000000000" w:firstRow="1" w:lastRow="0" w:firstColumn="0" w:lastColumn="0" w:oddVBand="0" w:evenVBand="0" w:oddHBand="0" w:evenHBand="0" w:firstRowFirstColumn="0" w:firstRowLastColumn="0" w:lastRowFirstColumn="0" w:lastRowLastColumn="0"/>
             </w:pPr>
+            <w:proofErr w:type="spellStart"/>
             <w:r>
               <w:t>WorkItem</w:t>
             </w:r>
+            <w:proofErr w:type="spellEnd"/>
           </w:p>
         </w:tc>
         <w:tc>
@@ -910,11 +1060,53 @@
             <w:pPr>
               <w:cnfStyle w:val="000000100000" w:firstRow="0" w:lastRow="0" w:firstColumn="0" w:lastColumn="0" w:oddVBand="0" w:evenVBand="0" w:oddHBand="1" w:evenHBand="0" w:firstRowFirstColumn="0" w:firstRowLastColumn="0" w:lastRowFirstColumn="0" w:lastRowLastColumn="0"/>
             </w:pPr>
+            <w:proofErr w:type="spellStart"/>
             <w:r>
               <w:t>ProductionTask</w:t>
             </w:r>
-            <w:r>
-              <w:t xml:space="preserve"> (castLead, findLocation, filmScene, editScene, addEffects)</w:t>
+            <w:proofErr w:type="spellEnd"/>
+            <w:r>
+              <w:t xml:space="preserve"> (</w:t>
+            </w:r>
+            <w:proofErr w:type="spellStart"/>
+            <w:r>
+              <w:t>castLead</w:t>
+            </w:r>
+            <w:proofErr w:type="spellEnd"/>
+            <w:r>
+              <w:t xml:space="preserve">, </w:t>
+            </w:r>
+            <w:proofErr w:type="spellStart"/>
+            <w:r>
+              <w:t>findLocation</w:t>
+            </w:r>
+            <w:proofErr w:type="spellEnd"/>
+            <w:r>
+              <w:t xml:space="preserve">, </w:t>
+            </w:r>
+            <w:proofErr w:type="spellStart"/>
+            <w:r>
+              <w:t>filmScene</w:t>
+            </w:r>
+            <w:proofErr w:type="spellEnd"/>
+            <w:r>
+              <w:t xml:space="preserve">, </w:t>
+            </w:r>
+            <w:proofErr w:type="spellStart"/>
+            <w:r>
+              <w:t>editScene</w:t>
+            </w:r>
+            <w:proofErr w:type="spellEnd"/>
+            <w:r>
+              <w:t xml:space="preserve">, </w:t>
+            </w:r>
+            <w:proofErr w:type="spellStart"/>
+            <w:r>
+              <w:t>addEffects</w:t>
+            </w:r>
+            <w:proofErr w:type="spellEnd"/>
+            <w:r>
+              <w:t>)</w:t>
             </w:r>
           </w:p>
         </w:tc>
@@ -952,9 +1144,11 @@
             <w:pPr>
               <w:cnfStyle w:val="000000000000" w:firstRow="0" w:lastRow="0" w:firstColumn="0" w:lastColumn="0" w:oddVBand="0" w:evenVBand="0" w:oddHBand="0" w:evenHBand="0" w:firstRowFirstColumn="0" w:firstRowLastColumn="0" w:lastRowFirstColumn="0" w:lastRowLastColumn="0"/>
             </w:pPr>
+            <w:proofErr w:type="spellStart"/>
             <w:r>
               <w:t>WorkItemDecorator</w:t>
             </w:r>
+            <w:proofErr w:type="spellEnd"/>
           </w:p>
         </w:tc>
         <w:tc>
@@ -966,8 +1160,13 @@
               <w:cnfStyle w:val="000000000000" w:firstRow="0" w:lastRow="0" w:firstColumn="0" w:lastColumn="0" w:oddVBand="0" w:evenVBand="0" w:oddHBand="0" w:evenHBand="0" w:firstRowFirstColumn="0" w:firstRowLastColumn="0" w:lastRowFirstColumn="0" w:lastRowLastColumn="0"/>
             </w:pPr>
             <w:r>
-              <w:t>Base wrapper implementing WorkItem</w:t>
-            </w:r>
+              <w:t xml:space="preserve">Base wrapper implementing </w:t>
+            </w:r>
+            <w:proofErr w:type="spellStart"/>
+            <w:r>
+              <w:t>WorkItem</w:t>
+            </w:r>
+            <w:proofErr w:type="spellEnd"/>
           </w:p>
         </w:tc>
       </w:tr>
@@ -981,9 +1180,11 @@
             <w:tcW w:w="3116" w:type="dxa"/>
           </w:tcPr>
           <w:p>
+            <w:proofErr w:type="spellStart"/>
             <w:r>
               <w:t>ConcreteDecorator</w:t>
             </w:r>
+            <w:proofErr w:type="spellEnd"/>
           </w:p>
         </w:tc>
         <w:tc>
@@ -994,14 +1195,21 @@
             <w:pPr>
               <w:cnfStyle w:val="000000100000" w:firstRow="0" w:lastRow="0" w:firstColumn="0" w:lastColumn="0" w:oddVBand="0" w:evenVBand="0" w:oddHBand="1" w:evenHBand="0" w:firstRowFirstColumn="0" w:firstRowLastColumn="0" w:lastRowFirstColumn="0" w:lastRowLastColumn="0"/>
             </w:pPr>
+            <w:proofErr w:type="spellStart"/>
             <w:r>
               <w:t>SafetyCheck</w:t>
             </w:r>
+            <w:proofErr w:type="spellEnd"/>
             <w:r>
               <w:t xml:space="preserve">, </w:t>
             </w:r>
-            <w:r>
-              <w:t>EquipementCheck, Insurance</w:t>
+            <w:proofErr w:type="spellStart"/>
+            <w:r>
+              <w:t>EquipementCheck</w:t>
+            </w:r>
+            <w:proofErr w:type="spellEnd"/>
+            <w:r>
+              <w:t>, Insurance</w:t>
             </w:r>
           </w:p>
         </w:tc>
@@ -1056,13 +1264,49 @@
         </w:rPr>
       </w:pPr>
       <w:r>
-        <w:t xml:space="preserve">Composite: WorkItem </w:t>
-      </w:r>
-      <w:r>
-        <w:rPr>
-          <w:rFonts w:cstheme="minorHAnsi"/>
-        </w:rPr>
-        <w:t xml:space="preserve">← ProductionTask, WorkGroup </w:t>
+        <w:t xml:space="preserve">Composite: </w:t>
+      </w:r>
+      <w:proofErr w:type="spellStart"/>
+      <w:r>
+        <w:t>WorkItem</w:t>
+      </w:r>
+      <w:proofErr w:type="spellEnd"/>
+      <w:r>
+        <w:t xml:space="preserve"> </w:t>
+      </w:r>
+      <w:r>
+        <w:rPr>
+          <w:rFonts w:cstheme="minorHAnsi"/>
+        </w:rPr>
+        <w:t xml:space="preserve">← </w:t>
+      </w:r>
+      <w:proofErr w:type="spellStart"/>
+      <w:r>
+        <w:rPr>
+          <w:rFonts w:cstheme="minorHAnsi"/>
+        </w:rPr>
+        <w:t>ProductionTask</w:t>
+      </w:r>
+      <w:proofErr w:type="spellEnd"/>
+      <w:r>
+        <w:rPr>
+          <w:rFonts w:cstheme="minorHAnsi"/>
+        </w:rPr>
+        <w:t xml:space="preserve">, </w:t>
+      </w:r>
+      <w:proofErr w:type="spellStart"/>
+      <w:r>
+        <w:rPr>
+          <w:rFonts w:cstheme="minorHAnsi"/>
+        </w:rPr>
+        <w:t>WorkGroup</w:t>
+      </w:r>
+      <w:proofErr w:type="spellEnd"/>
+      <w:r>
+        <w:rPr>
+          <w:rFonts w:cstheme="minorHAnsi"/>
+        </w:rPr>
+        <w:t xml:space="preserve"> </w:t>
       </w:r>
       <w:r>
         <w:rPr>
@@ -1074,20 +1318,48 @@
         <w:rPr>
           <w:rFonts w:cstheme="minorHAnsi"/>
         </w:rPr>
-        <w:t xml:space="preserve"> ProductionPhase, Scene</w:t>
-      </w:r>
-    </w:p>
-    <w:p>
-      <w:pPr>
-        <w:rPr>
-          <w:rFonts w:cstheme="minorHAnsi"/>
-        </w:rPr>
-      </w:pPr>
-      <w:r>
-        <w:rPr>
-          <w:rFonts w:cstheme="minorHAnsi"/>
-        </w:rPr>
-        <w:t xml:space="preserve">Iterator: WorkIterator </w:t>
+        <w:t xml:space="preserve"> </w:t>
+      </w:r>
+      <w:proofErr w:type="spellStart"/>
+      <w:r>
+        <w:rPr>
+          <w:rFonts w:cstheme="minorHAnsi"/>
+        </w:rPr>
+        <w:t>ProductionPhase</w:t>
+      </w:r>
+      <w:proofErr w:type="spellEnd"/>
+      <w:r>
+        <w:rPr>
+          <w:rFonts w:cstheme="minorHAnsi"/>
+        </w:rPr>
+        <w:t>, Scene</w:t>
+      </w:r>
+    </w:p>
+    <w:p>
+      <w:pPr>
+        <w:rPr>
+          <w:rFonts w:cstheme="minorHAnsi"/>
+        </w:rPr>
+      </w:pPr>
+      <w:r>
+        <w:rPr>
+          <w:rFonts w:cstheme="minorHAnsi"/>
+        </w:rPr>
+        <w:t xml:space="preserve">Iterator: </w:t>
+      </w:r>
+      <w:proofErr w:type="spellStart"/>
+      <w:r>
+        <w:rPr>
+          <w:rFonts w:cstheme="minorHAnsi"/>
+        </w:rPr>
+        <w:t>WorkIterator</w:t>
+      </w:r>
+      <w:proofErr w:type="spellEnd"/>
+      <w:r>
+        <w:rPr>
+          <w:rFonts w:cstheme="minorHAnsi"/>
+        </w:rPr>
+        <w:t xml:space="preserve"> </w:t>
       </w:r>
       <w:r>
         <w:rPr>
@@ -1099,8 +1371,30 @@
         <w:rPr>
           <w:rFonts w:cstheme="minorHAnsi"/>
         </w:rPr>
-        <w:t xml:space="preserve"> ProductionOrderIterator, PriorityIterator</w:t>
-      </w:r>
+        <w:t xml:space="preserve"> </w:t>
+      </w:r>
+      <w:proofErr w:type="spellStart"/>
+      <w:r>
+        <w:rPr>
+          <w:rFonts w:cstheme="minorHAnsi"/>
+        </w:rPr>
+        <w:t>ProductionOrderIterator</w:t>
+      </w:r>
+      <w:proofErr w:type="spellEnd"/>
+      <w:r>
+        <w:rPr>
+          <w:rFonts w:cstheme="minorHAnsi"/>
+        </w:rPr>
+        <w:t xml:space="preserve">, </w:t>
+      </w:r>
+      <w:proofErr w:type="spellStart"/>
+      <w:r>
+        <w:rPr>
+          <w:rFonts w:cstheme="minorHAnsi"/>
+        </w:rPr>
+        <w:t>PriorityIterator</w:t>
+      </w:r>
+      <w:proofErr w:type="spellEnd"/>
     </w:p>
     <w:p>
       <w:pPr>
@@ -1137,7 +1431,21 @@
         <w:rPr>
           <w:rFonts w:cstheme="minorHAnsi"/>
         </w:rPr>
-        <w:t xml:space="preserve">Decorator: WorkItem </w:t>
+        <w:t xml:space="preserve">Decorator: </w:t>
+      </w:r>
+      <w:proofErr w:type="spellStart"/>
+      <w:r>
+        <w:rPr>
+          <w:rFonts w:cstheme="minorHAnsi"/>
+        </w:rPr>
+        <w:t>WorkItem</w:t>
+      </w:r>
+      <w:proofErr w:type="spellEnd"/>
+      <w:r>
+        <w:rPr>
+          <w:rFonts w:cstheme="minorHAnsi"/>
+        </w:rPr>
+        <w:t xml:space="preserve"> </w:t>
       </w:r>
       <w:r>
         <w:rPr>
@@ -1149,7 +1457,21 @@
         <w:rPr>
           <w:rFonts w:cstheme="minorHAnsi"/>
         </w:rPr>
-        <w:t xml:space="preserve"> WorkItemDecorator </w:t>
+        <w:t xml:space="preserve"> </w:t>
+      </w:r>
+      <w:proofErr w:type="spellStart"/>
+      <w:r>
+        <w:rPr>
+          <w:rFonts w:cstheme="minorHAnsi"/>
+        </w:rPr>
+        <w:t>WorkItemDecorator</w:t>
+      </w:r>
+      <w:proofErr w:type="spellEnd"/>
+      <w:r>
+        <w:rPr>
+          <w:rFonts w:cstheme="minorHAnsi"/>
+        </w:rPr>
+        <w:t xml:space="preserve"> </w:t>
       </w:r>
       <w:r>
         <w:rPr>
@@ -1161,8 +1483,30 @@
         <w:rPr>
           <w:rFonts w:cstheme="minorHAnsi"/>
         </w:rPr>
-        <w:t xml:space="preserve"> SafetyCheckDecorator, EquipmentCheckDecorator</w:t>
-      </w:r>
+        <w:t xml:space="preserve"> </w:t>
+      </w:r>
+      <w:proofErr w:type="spellStart"/>
+      <w:r>
+        <w:rPr>
+          <w:rFonts w:cstheme="minorHAnsi"/>
+        </w:rPr>
+        <w:t>SafetyCheckDecorator</w:t>
+      </w:r>
+      <w:proofErr w:type="spellEnd"/>
+      <w:r>
+        <w:rPr>
+          <w:rFonts w:cstheme="minorHAnsi"/>
+        </w:rPr>
+        <w:t xml:space="preserve">, </w:t>
+      </w:r>
+      <w:proofErr w:type="spellStart"/>
+      <w:r>
+        <w:rPr>
+          <w:rFonts w:cstheme="minorHAnsi"/>
+        </w:rPr>
+        <w:t>EquipmentCheckDecorator</w:t>
+      </w:r>
+      <w:proofErr w:type="spellEnd"/>
     </w:p>
     <w:p>
       <w:pPr>
@@ -1200,55 +1544,45 @@
           <w:b/>
           <w:i/>
         </w:rPr>
-        <w:t>Why use WorkItem?</w:t>
-      </w:r>
-      <w:r>
-        <w:rPr>
-          <w:rFonts w:cstheme="minorHAnsi"/>
-        </w:rPr>
-        <w:t xml:space="preserve"> WorkItem provides a common abstraction for both individual production tasks and groups of work. This allows the Composite pattern to treat individual and grouped work uniformly.</w:t>
-      </w:r>
-    </w:p>
-    <w:p>
-      <w:pPr>
-        <w:rPr>
-          <w:rFonts w:cstheme="minorHAnsi"/>
-        </w:rPr>
-      </w:pPr>
+        <w:t xml:space="preserve">Why use </w:t>
+      </w:r>
+      <w:proofErr w:type="spellStart"/>
       <w:r>
         <w:rPr>
           <w:rFonts w:cstheme="minorHAnsi"/>
           <w:b/>
           <w:i/>
         </w:rPr>
-        <w:t>Why use WorkGroup?</w:t>
-      </w:r>
-      <w:r>
-        <w:rPr>
-          <w:rFonts w:cstheme="minorHAnsi"/>
-        </w:rPr>
-        <w:t xml:space="preserve"> Film production naturally consists of recursively nested groups. WorkGroup allows a group to contain other WorkItems, creating the required hierarchical structure.</w:t>
-      </w:r>
-    </w:p>
-    <w:p>
-      <w:pPr>
-        <w:rPr>
-          <w:rFonts w:cstheme="minorHAnsi"/>
-        </w:rPr>
-      </w:pPr>
+        <w:t>WorkItem</w:t>
+      </w:r>
+      <w:proofErr w:type="spellEnd"/>
       <w:r>
         <w:rPr>
           <w:rFonts w:cstheme="minorHAnsi"/>
           <w:b/>
           <w:i/>
         </w:rPr>
-        <w:t>Why use ProductionPhase and Scene?</w:t>
-      </w:r>
-      <w:r>
-        <w:rPr>
-          <w:rFonts w:cstheme="minorHAnsi"/>
-        </w:rPr>
-        <w:t xml:space="preserve"> These provide concrete domain meaning to the composite hierarchy instead of creating a generic tree with no connection to the film-production problem.</w:t>
+        <w:t>?</w:t>
+      </w:r>
+      <w:r>
+        <w:rPr>
+          <w:rFonts w:cstheme="minorHAnsi"/>
+        </w:rPr>
+        <w:t xml:space="preserve"> </w:t>
+      </w:r>
+      <w:proofErr w:type="spellStart"/>
+      <w:r>
+        <w:rPr>
+          <w:rFonts w:cstheme="minorHAnsi"/>
+        </w:rPr>
+        <w:t>WorkItem</w:t>
+      </w:r>
+      <w:proofErr w:type="spellEnd"/>
+      <w:r>
+        <w:rPr>
+          <w:rFonts w:cstheme="minorHAnsi"/>
+        </w:rPr>
+        <w:t xml:space="preserve"> provides a common abstraction for both individual production tasks and groups of work. This allows the Composite pattern to treat individual and grouped work uniformly.</w:t>
       </w:r>
     </w:p>
     <w:p>
@@ -1263,13 +1597,147 @@
           <w:b/>
           <w:i/>
         </w:rPr>
+        <w:t xml:space="preserve">Why use </w:t>
+      </w:r>
+      <w:proofErr w:type="spellStart"/>
+      <w:r>
+        <w:rPr>
+          <w:rFonts w:cstheme="minorHAnsi"/>
+          <w:b/>
+          <w:i/>
+        </w:rPr>
+        <w:t>WorkGroup</w:t>
+      </w:r>
+      <w:proofErr w:type="spellEnd"/>
+      <w:r>
+        <w:rPr>
+          <w:rFonts w:cstheme="minorHAnsi"/>
+          <w:b/>
+          <w:i/>
+        </w:rPr>
+        <w:t>?</w:t>
+      </w:r>
+      <w:r>
+        <w:rPr>
+          <w:rFonts w:cstheme="minorHAnsi"/>
+        </w:rPr>
+        <w:t xml:space="preserve"> Film production naturally consists of recursively nested groups. </w:t>
+      </w:r>
+      <w:proofErr w:type="spellStart"/>
+      <w:r>
+        <w:rPr>
+          <w:rFonts w:cstheme="minorHAnsi"/>
+        </w:rPr>
+        <w:t>WorkGroup</w:t>
+      </w:r>
+      <w:proofErr w:type="spellEnd"/>
+      <w:r>
+        <w:rPr>
+          <w:rFonts w:cstheme="minorHAnsi"/>
+        </w:rPr>
+        <w:t xml:space="preserve"> allows a group to contain other </w:t>
+      </w:r>
+      <w:proofErr w:type="spellStart"/>
+      <w:r>
+        <w:rPr>
+          <w:rFonts w:cstheme="minorHAnsi"/>
+        </w:rPr>
+        <w:t>WorkItems</w:t>
+      </w:r>
+      <w:proofErr w:type="spellEnd"/>
+      <w:r>
+        <w:rPr>
+          <w:rFonts w:cstheme="minorHAnsi"/>
+        </w:rPr>
+        <w:t>, creating the required hierarchical structure.</w:t>
+      </w:r>
+    </w:p>
+    <w:p>
+      <w:pPr>
+        <w:rPr>
+          <w:rFonts w:cstheme="minorHAnsi"/>
+        </w:rPr>
+      </w:pPr>
+      <w:r>
+        <w:rPr>
+          <w:rFonts w:cstheme="minorHAnsi"/>
+          <w:b/>
+          <w:i/>
+        </w:rPr>
+        <w:t xml:space="preserve">Why use </w:t>
+      </w:r>
+      <w:proofErr w:type="spellStart"/>
+      <w:r>
+        <w:rPr>
+          <w:rFonts w:cstheme="minorHAnsi"/>
+          <w:b/>
+          <w:i/>
+        </w:rPr>
+        <w:t>ProductionPhase</w:t>
+      </w:r>
+      <w:proofErr w:type="spellEnd"/>
+      <w:r>
+        <w:rPr>
+          <w:rFonts w:cstheme="minorHAnsi"/>
+          <w:b/>
+          <w:i/>
+        </w:rPr>
+        <w:t xml:space="preserve"> and Scene?</w:t>
+      </w:r>
+      <w:r>
+        <w:rPr>
+          <w:rFonts w:cstheme="minorHAnsi"/>
+        </w:rPr>
+        <w:t xml:space="preserve"> These provide concrete domain meaning to the composite hierarchy instead of creating a generic tree with no connection to the film-production problem.</w:t>
+      </w:r>
+    </w:p>
+    <w:p>
+      <w:pPr>
+        <w:rPr>
+          <w:rFonts w:cstheme="minorHAnsi"/>
+        </w:rPr>
+      </w:pPr>
+      <w:r>
+        <w:rPr>
+          <w:rFonts w:cstheme="minorHAnsi"/>
+          <w:b/>
+          <w:i/>
+        </w:rPr>
         <w:t>Why use two iterators?</w:t>
       </w:r>
       <w:r>
         <w:rPr>
           <w:rFonts w:cstheme="minorHAnsi"/>
         </w:rPr>
-        <w:t xml:space="preserve"> Different users may need different views of the same production. ProductionOrderIterator follows the production hierarchy, while PriorityIterator identifies the most </w:t>
+        <w:t xml:space="preserve"> Different users may need different views of the same production. </w:t>
+      </w:r>
+      <w:proofErr w:type="spellStart"/>
+      <w:r>
+        <w:rPr>
+          <w:rFonts w:cstheme="minorHAnsi"/>
+        </w:rPr>
+        <w:t>ProductionOrderIterator</w:t>
+      </w:r>
+      <w:proofErr w:type="spellEnd"/>
+      <w:r>
+        <w:rPr>
+          <w:rFonts w:cstheme="minorHAnsi"/>
+        </w:rPr>
+        <w:t xml:space="preserve"> follows the production hierarchy, while </w:t>
+      </w:r>
+      <w:proofErr w:type="spellStart"/>
+      <w:r>
+        <w:rPr>
+          <w:rFonts w:cstheme="minorHAnsi"/>
+        </w:rPr>
+        <w:t>PriorityIterator</w:t>
+      </w:r>
+      <w:proofErr w:type="spellEnd"/>
+      <w:r>
+        <w:rPr>
+          <w:rFonts w:cstheme="minorHAnsi"/>
+        </w:rPr>
+        <w:t xml:space="preserve"> identifies the most </w:t>
       </w:r>
       <w:r>
         <w:rPr>
@@ -1318,7 +1786,21 @@
         <w:rPr>
           <w:rFonts w:cstheme="minorHAnsi"/>
         </w:rPr>
-        <w:t xml:space="preserve"> Some production tasks require additional responsibilities only in particular circumstances. Safety checks and equipment checks can therefore be added dynamically without modifying ProductionTask.</w:t>
+        <w:t xml:space="preserve"> Some production tasks require additional responsibilities only in particular circumstances. Safety checks and equipment checks can therefore be added dynamically without modifying </w:t>
+      </w:r>
+      <w:proofErr w:type="spellStart"/>
+      <w:r>
+        <w:rPr>
+          <w:rFonts w:cstheme="minorHAnsi"/>
+        </w:rPr>
+        <w:t>ProductionTask</w:t>
+      </w:r>
+      <w:proofErr w:type="spellEnd"/>
+      <w:r>
+        <w:rPr>
+          <w:rFonts w:cstheme="minorHAnsi"/>
+        </w:rPr>
+        <w:t>.</w:t>
       </w:r>
     </w:p>
     <w:p>
@@ -1354,34 +1836,84 @@
           <w:b/>
           <w:i/>
         </w:rPr>
-        <w:t>Why use composition for WorkGroup → WorkItem?</w:t>
-      </w:r>
-      <w:r>
-        <w:rPr>
-          <w:rFonts w:cstheme="minorHAnsi"/>
-        </w:rPr>
-        <w:t xml:space="preserve"> The group owns the work items within it. This gives the system a clear destruction policy and makes the recursive hierarchy straightforward to manage.</w:t>
-      </w:r>
-    </w:p>
-    <w:p>
-      <w:pPr>
-        <w:rPr>
-          <w:rFonts w:cstheme="minorHAnsi"/>
-        </w:rPr>
-      </w:pPr>
+        <w:t xml:space="preserve">Why use composition for </w:t>
+      </w:r>
+      <w:proofErr w:type="spellStart"/>
       <w:r>
         <w:rPr>
           <w:rFonts w:cstheme="minorHAnsi"/>
           <w:b/>
           <w:i/>
         </w:rPr>
+        <w:t>WorkGroup</w:t>
+      </w:r>
+      <w:proofErr w:type="spellEnd"/>
+      <w:r>
+        <w:rPr>
+          <w:rFonts w:cstheme="minorHAnsi"/>
+          <w:b/>
+          <w:i/>
+        </w:rPr>
+        <w:t xml:space="preserve"> → </w:t>
+      </w:r>
+      <w:proofErr w:type="spellStart"/>
+      <w:r>
+        <w:rPr>
+          <w:rFonts w:cstheme="minorHAnsi"/>
+          <w:b/>
+          <w:i/>
+        </w:rPr>
+        <w:t>WorkItem</w:t>
+      </w:r>
+      <w:proofErr w:type="spellEnd"/>
+      <w:r>
+        <w:rPr>
+          <w:rFonts w:cstheme="minorHAnsi"/>
+          <w:b/>
+          <w:i/>
+        </w:rPr>
+        <w:t>?</w:t>
+      </w:r>
+      <w:r>
+        <w:rPr>
+          <w:rFonts w:cstheme="minorHAnsi"/>
+        </w:rPr>
+        <w:t xml:space="preserve"> The group owns the work items within it. This gives the system a clear destruction policy and makes the recursive hierarchy straightforward to manage.</w:t>
+      </w:r>
+    </w:p>
+    <w:p>
+      <w:pPr>
+        <w:rPr>
+          <w:rFonts w:cstheme="minorHAnsi"/>
+        </w:rPr>
+      </w:pPr>
+      <w:r>
+        <w:rPr>
+          <w:rFonts w:cstheme="minorHAnsi"/>
+          <w:b/>
+          <w:i/>
+        </w:rPr>
         <w:t>How we keep the design relatively small?</w:t>
       </w:r>
       <w:r>
         <w:rPr>
           <w:rFonts w:cstheme="minorHAnsi"/>
         </w:rPr>
-        <w:t xml:space="preserve"> Since we are advised to keep the design relatively small, we deliberately do not model cameras, budgets, contracts, crew members, costumes, etc. as separate systems. They can appear as the subject of tasks, but TaskForge's responsibility is </w:t>
+        <w:t xml:space="preserve"> Since we are advised to keep the design relatively small, we deliberately do not model cameras, budgets, contracts, crew members, costumes, etc. as separate systems. They can appear as the subject of tasks, but </w:t>
+      </w:r>
+      <w:proofErr w:type="spellStart"/>
+      <w:r>
+        <w:rPr>
+          <w:rFonts w:cstheme="minorHAnsi"/>
+        </w:rPr>
+        <w:t>TaskForge's</w:t>
+      </w:r>
+      <w:proofErr w:type="spellEnd"/>
+      <w:r>
+        <w:rPr>
+          <w:rFonts w:cstheme="minorHAnsi"/>
+        </w:rPr>
+        <w:t xml:space="preserve"> responsibility is </w:t>
       </w:r>
       <w:r>
         <w:rPr>
@@ -1405,6 +1937,242 @@
       <w:r>
         <w:br w:type="page"/>
       </w:r>
+      <w:r>
+        <w:lastRenderedPageBreak/>
+        <w:t>Task 3</w:t>
+      </w:r>
+      <w:r>
+        <w:br/>
+      </w:r>
+    </w:p>
+    <w:p>
+      <w:r>
+        <w:t>We adopted a snapshot policy for all iterators. When a</w:t>
+      </w:r>
+      <w:r>
+        <w:t xml:space="preserve">n Iterator </w:t>
+      </w:r>
+      <w:r>
+        <w:t>is created, it captures the current structure of the relevant part of the hierarchy at that moment. Subsequent structural modifications to the live hierarchy</w:t>
+      </w:r>
+      <w:r>
+        <w:t xml:space="preserve"> </w:t>
+      </w:r>
+      <w:r>
+        <w:t>do not affect any already-created iterators.</w:t>
+      </w:r>
+      <w:r>
+        <w:t xml:space="preserve"> S</w:t>
+      </w:r>
+      <w:r>
+        <w:t>uch as moving a Shot between Scenes, adding a reshoot, or removing a completed item</w:t>
+      </w:r>
+      <w:r>
+        <w:t>,</w:t>
+      </w:r>
+      <w:r>
+        <w:t xml:space="preserve"> </w:t>
+      </w:r>
+    </w:p>
+    <w:p>
+      <w:r>
+        <w:t>This policy was chosen</w:t>
+      </w:r>
+      <w:r>
+        <w:t xml:space="preserve"> because</w:t>
+      </w:r>
+      <w:r>
+        <w:t>:</w:t>
+      </w:r>
+    </w:p>
+    <w:p>
+      <w:r>
+        <w:t>It guarantees that an in-progress traversal (for example</w:t>
+      </w:r>
+      <w:r>
+        <w:t>,</w:t>
+      </w:r>
+      <w:r>
+        <w:t xml:space="preserve"> a full production progress) remains consistent and does not crash or produce </w:t>
+      </w:r>
+      <w:r>
+        <w:t xml:space="preserve">corrupted </w:t>
+      </w:r>
+      <w:r>
+        <w:t>results.</w:t>
+      </w:r>
+    </w:p>
+    <w:p>
+      <w:r>
+        <w:t xml:space="preserve">It keeps iterator simple and free of complex invalidation or </w:t>
+      </w:r>
+      <w:r>
+        <w:t xml:space="preserve">needing </w:t>
+      </w:r>
+      <w:r>
+        <w:t>live-update logic.</w:t>
+      </w:r>
+    </w:p>
+    <w:p>
+      <w:r>
+        <w:t>It matches real production behaviour: once a progress report has been generated</w:t>
+      </w:r>
+      <w:r>
+        <w:t xml:space="preserve"> and later </w:t>
+      </w:r>
+      <w:r>
+        <w:t>changes on set do not alter that report.</w:t>
+      </w:r>
+    </w:p>
+    <w:p>
+      <w:r>
+        <w:t xml:space="preserve">Clients that need an up-to-date view </w:t>
+      </w:r>
+      <w:r>
+        <w:t>can</w:t>
+      </w:r>
+      <w:r>
+        <w:t xml:space="preserve"> create a new iterator after the modification.</w:t>
+      </w:r>
+    </w:p>
+    <w:p/>
+    <w:p>
+      <w:r>
+        <w:t>Other Important Design Decisions</w:t>
+      </w:r>
+      <w:r>
+        <w:t>:</w:t>
+      </w:r>
+    </w:p>
+    <w:p>
+      <w:r>
+        <w:t xml:space="preserve">Ownership: </w:t>
+      </w:r>
+      <w:proofErr w:type="spellStart"/>
+      <w:r>
+        <w:t>WorkGroup</w:t>
+      </w:r>
+      <w:proofErr w:type="spellEnd"/>
+      <w:r>
+        <w:t xml:space="preserve"> owns its children</w:t>
+      </w:r>
+      <w:r>
+        <w:t xml:space="preserve">. </w:t>
+      </w:r>
+      <w:r>
+        <w:t xml:space="preserve">Decorators own the component they wrap. Each Shot owns its current </w:t>
+      </w:r>
+      <w:proofErr w:type="spellStart"/>
+      <w:r>
+        <w:t>ShotState</w:t>
+      </w:r>
+      <w:proofErr w:type="spellEnd"/>
+      <w:r>
+        <w:t xml:space="preserve">. Iterators hold only non-owning raw pointers. This produces </w:t>
+      </w:r>
+      <w:r>
+        <w:t xml:space="preserve">leak-free </w:t>
+      </w:r>
+      <w:r>
+        <w:t>destruction.</w:t>
+      </w:r>
+    </w:p>
+    <w:p>
+      <w:r>
+        <w:t xml:space="preserve">State ownership: </w:t>
+      </w:r>
+      <w:r>
+        <w:t>E</w:t>
+      </w:r>
+      <w:r>
+        <w:t>ach Shot deletes its current state when transitioning. This keeps the design straightforward</w:t>
+      </w:r>
+      <w:r>
+        <w:t xml:space="preserve">. It also </w:t>
+      </w:r>
+      <w:r>
+        <w:t>avoids lifetime coupling between many shots and shared state objects.</w:t>
+      </w:r>
+    </w:p>
+    <w:p>
+      <w:r>
+        <w:t>Decorator applicability: Decorators can be applied to both individual Shots and</w:t>
+      </w:r>
+      <w:r>
+        <w:t xml:space="preserve"> </w:t>
+      </w:r>
+      <w:r>
+        <w:t xml:space="preserve">to </w:t>
+      </w:r>
+      <w:proofErr w:type="spellStart"/>
+      <w:r>
+        <w:t>WorkGroups</w:t>
+      </w:r>
+      <w:proofErr w:type="spellEnd"/>
+      <w:r>
+        <w:t>. Stacking order is significant</w:t>
+      </w:r>
+      <w:r>
+        <w:t>. For example,</w:t>
+      </w:r>
+      <w:r>
+        <w:t xml:space="preserve"> P</w:t>
+      </w:r>
+      <w:proofErr w:type="spellStart"/>
+      <w:r>
+        <w:t>riorityDecorator</w:t>
+      </w:r>
+      <w:proofErr w:type="spellEnd"/>
+      <w:r>
+        <w:t xml:space="preserve"> outermost so that priority queries see the full decorated behaviour</w:t>
+      </w:r>
+      <w:r>
+        <w:t xml:space="preserve">. </w:t>
+      </w:r>
+    </w:p>
+    <w:p>
+      <w:r>
+        <w:t>I</w:t>
+      </w:r>
+      <w:r>
+        <w:t xml:space="preserve">nternal containers: Client code never receives the raw container of a </w:t>
+      </w:r>
+      <w:proofErr w:type="spellStart"/>
+      <w:r>
+        <w:t>WorkGroup</w:t>
+      </w:r>
+      <w:proofErr w:type="spellEnd"/>
+      <w:r>
+        <w:t>. All traversal is performed exclusively through iterators.</w:t>
+      </w:r>
+    </w:p>
+    <w:p>
+      <w:r>
+        <w:t>H</w:t>
+      </w:r>
+      <w:r>
+        <w:t>ierarchy depth: We kept the number of concrete composite types low while still guaranteeing at least three levels of nesting below the root</w:t>
+      </w:r>
+      <w:r>
+        <w:t>. There is also a</w:t>
+      </w:r>
+      <w:r>
+        <w:t xml:space="preserve"> realistic mix of leaves and </w:t>
+      </w:r>
+      <w:r>
+        <w:t>internal nodes</w:t>
+      </w:r>
+      <w:r>
+        <w:t>.</w:t>
+      </w:r>
+      <w:r>
+        <w:br w:type="page"/>
+      </w:r>
+    </w:p>
+    <w:p>
+      <w:pPr>
+        <w:pStyle w:val="Heading1"/>
+      </w:pPr>
       <w:r>
         <w:lastRenderedPageBreak/>
         <w:t>Task 4</w:t>
@@ -1413,7 +2181,15 @@
     <w:p/>
     <w:p>
       <w:r>
-        <w:t>Object diagram representing FimProduction hierarchy and decorator wrapping after the execution of Scenario 2 in main.cpp</w:t>
+        <w:t xml:space="preserve">Object diagram representing </w:t>
+      </w:r>
+      <w:proofErr w:type="spellStart"/>
+      <w:r>
+        <w:t>FimProduction</w:t>
+      </w:r>
+      <w:proofErr w:type="spellEnd"/>
+      <w:r>
+        <w:t xml:space="preserve"> hierarchy and decorator wrapping after the execution of Scenario 2 in main.cpp</w:t>
       </w:r>
     </w:p>
     <w:p>
@@ -1473,8 +2249,13 @@
     <w:p>
       <w:r>
         <w:lastRenderedPageBreak/>
-        <w:t>State diagram representing states of a productionTask</w:t>
-      </w:r>
+        <w:t xml:space="preserve">State diagram representing states of a </w:t>
+      </w:r>
+      <w:proofErr w:type="spellStart"/>
+      <w:r>
+        <w:t>productionTask</w:t>
+      </w:r>
+      <w:proofErr w:type="spellEnd"/>
     </w:p>
     <w:p>
       <w:r>
@@ -1582,8 +2363,13 @@
     <w:p>
       <w:r>
         <w:lastRenderedPageBreak/>
-        <w:t>Activity diagram 2 representing the flow of the Iterator class with productionTask</w:t>
-      </w:r>
+        <w:t xml:space="preserve">Activity diagram 2 representing the flow of the Iterator class with </w:t>
+      </w:r>
+      <w:proofErr w:type="spellStart"/>
+      <w:r>
+        <w:t>productionTask</w:t>
+      </w:r>
+      <w:proofErr w:type="spellEnd"/>
     </w:p>
     <w:p>
       <w:r>
@@ -1635,8 +2421,13 @@
     </w:p>
     <w:p>
       <w:r>
-        <w:t>Activity diagram representing the flow of states in productionTask</w:t>
-      </w:r>
+        <w:t xml:space="preserve">Activity diagram representing the flow of states in </w:t>
+      </w:r>
+      <w:proofErr w:type="spellStart"/>
+      <w:r>
+        <w:t>productionTask</w:t>
+      </w:r>
+      <w:proofErr w:type="spellEnd"/>
     </w:p>
     <w:p>
       <w:r>
@@ -1701,7 +2492,15 @@
     <w:p/>
     <w:p>
       <w:r>
-        <w:t>Using gdb while implementing:</w:t>
+        <w:t xml:space="preserve">Using </w:t>
+      </w:r>
+      <w:proofErr w:type="spellStart"/>
+      <w:r>
+        <w:t>gdb</w:t>
+      </w:r>
+      <w:proofErr w:type="spellEnd"/>
+      <w:r>
+        <w:t xml:space="preserve"> while implementing:</w:t>
       </w:r>
     </w:p>
     <w:p>
@@ -1796,8 +2595,13 @@
       </w:r>
     </w:p>
     <w:p>
-      <w:r>
-        <w:t>taskforge builds cleanly but crashes with a segmentation fault at program shutdown, after printing all of Scenario 2's output. A subtler tell shows up earlier too: the "</w:t>
+      <w:proofErr w:type="spellStart"/>
+      <w:r>
+        <w:t>taskforge</w:t>
+      </w:r>
+      <w:proofErr w:type="spellEnd"/>
+      <w:r>
+        <w:t xml:space="preserve"> builds cleanly but crashes with a segmentation fault at program shutdown, after printing all of Scenario 2's output. A subtler tell shows up earlier too: the "</w:t>
       </w:r>
       <w:r>
         <w:t>new</w:t>
@@ -1856,15 +2660,52 @@
     </w:p>
     <w:p>
       <w:r>
-        <w:t xml:space="preserve">In the weather-disruption scenario, the task added Set Up Lighting to warehouseClimax but never called harborOpening-&gt;remove(...) first. The same ProductionTask* was now in two </w:t>
-      </w:r>
+        <w:t xml:space="preserve">In the weather-disruption scenario, the task added Set Up Lighting to </w:t>
+      </w:r>
+      <w:proofErr w:type="spellStart"/>
+      <w:r>
+        <w:t>warehouseClimax</w:t>
+      </w:r>
+      <w:proofErr w:type="spellEnd"/>
+      <w:r>
+        <w:t xml:space="preserve"> but never called </w:t>
+      </w:r>
+      <w:proofErr w:type="spellStart"/>
+      <w:r>
+        <w:t>harborOpening</w:t>
+      </w:r>
+      <w:proofErr w:type="spellEnd"/>
+      <w:r>
+        <w:t xml:space="preserve">-&gt;remove(...) first. The same </w:t>
+      </w:r>
+      <w:proofErr w:type="spellStart"/>
+      <w:r>
+        <w:t>ProductionTask</w:t>
+      </w:r>
+      <w:proofErr w:type="spellEnd"/>
+      <w:r>
+        <w:t xml:space="preserve">* was now in two </w:t>
+      </w:r>
+      <w:proofErr w:type="spellStart"/>
       <w:proofErr w:type="gramStart"/>
       <w:r>
-        <w:t>WorkGroup::children</w:t>
+        <w:t>WorkGroup</w:t>
+      </w:r>
+      <w:proofErr w:type="spellEnd"/>
+      <w:r>
+        <w:t>::children</w:t>
       </w:r>
       <w:proofErr w:type="gramEnd"/>
       <w:r>
-        <w:t xml:space="preserve"> vectors. Both are WorkGroup, both own their children, and both delete every child in their destructor. The pointer gets deleted twice.</w:t>
+        <w:t xml:space="preserve"> vectors. Both are </w:t>
+      </w:r>
+      <w:proofErr w:type="spellStart"/>
+      <w:r>
+        <w:t>WorkGroup</w:t>
+      </w:r>
+      <w:proofErr w:type="spellEnd"/>
+      <w:r>
+        <w:t>, both own their children, and both delete every child in their destructor. The pointer gets deleted twice.</w:t>
       </w:r>
     </w:p>
     <w:p>
@@ -1963,6 +2804,7 @@
           <w:rFonts w:ascii="Courier New" w:hAnsi="Courier New" w:cs="Courier New"/>
         </w:rPr>
       </w:pPr>
+      <w:proofErr w:type="spellStart"/>
       <w:proofErr w:type="gramStart"/>
       <w:r>
         <w:rPr>
@@ -1970,6 +2812,7 @@
         </w:rPr>
         <w:t>world.harborOpening</w:t>
       </w:r>
+      <w:proofErr w:type="spellEnd"/>
       <w:proofErr w:type="gramEnd"/>
       <w:r>
         <w:rPr>
@@ -1977,6 +2820,7 @@
         </w:rPr>
         <w:t>-&gt;remove(</w:t>
       </w:r>
+      <w:proofErr w:type="spellStart"/>
       <w:proofErr w:type="gramStart"/>
       <w:r>
         <w:rPr>
@@ -1984,6 +2828,7 @@
         </w:rPr>
         <w:t>world.setUpLighting</w:t>
       </w:r>
+      <w:proofErr w:type="spellEnd"/>
       <w:proofErr w:type="gramEnd"/>
       <w:r>
         <w:rPr>
@@ -1998,6 +2843,7 @@
           <w:rFonts w:ascii="Courier New" w:hAnsi="Courier New" w:cs="Courier New"/>
         </w:rPr>
       </w:pPr>
+      <w:proofErr w:type="spellStart"/>
       <w:proofErr w:type="gramStart"/>
       <w:r>
         <w:rPr>
@@ -2005,6 +2851,7 @@
         </w:rPr>
         <w:t>world.warehouseClimax</w:t>
       </w:r>
+      <w:proofErr w:type="spellEnd"/>
       <w:proofErr w:type="gramEnd"/>
       <w:r>
         <w:rPr>
@@ -2012,6 +2859,7 @@
         </w:rPr>
         <w:t>-&gt;add(</w:t>
       </w:r>
+      <w:proofErr w:type="spellStart"/>
       <w:proofErr w:type="gramStart"/>
       <w:r>
         <w:rPr>
@@ -2019,6 +2867,7 @@
         </w:rPr>
         <w:t>world.setUpLighting</w:t>
       </w:r>
+      <w:proofErr w:type="spellEnd"/>
       <w:proofErr w:type="gramEnd"/>
       <w:r>
         <w:rPr>

</xml_diff>

<commit_message>
updated tasks 3 and 4
</commit_message>
<xml_diff>
--- a/COS214_P4.docx
+++ b/COS214_P4.docx
@@ -56,13 +56,8 @@
       </w:r>
     </w:p>
     <w:p>
-      <w:proofErr w:type="spellStart"/>
-      <w:r>
-        <w:t>TaskForge</w:t>
-      </w:r>
-      <w:proofErr w:type="spellEnd"/>
-      <w:r>
-        <w:t xml:space="preserve"> is a reusable work-processing system designed to manage the work involved in producing a film. Film production contains a large bo</w:t>
+      <w:r>
+        <w:t>TaskForge is a reusable work-processing system designed to manage the work involved in producing a film. Film production contains a large bo</w:t>
       </w:r>
       <w:r>
         <w:t>dy of work that can be broken</w:t>
@@ -73,15 +68,7 @@
     </w:p>
     <w:p>
       <w:r>
-        <w:t xml:space="preserve">The problem </w:t>
-      </w:r>
-      <w:proofErr w:type="spellStart"/>
-      <w:r>
-        <w:t>TaskForge</w:t>
-      </w:r>
-      <w:proofErr w:type="spellEnd"/>
-      <w:r>
-        <w:t xml:space="preserve"> solves is the difficulty of organising, processing and monitoring this hierarchical body of work while allowing production staff to:</w:t>
+        <w:t>The problem TaskForge solves is the difficulty of organising, processing and monitoring this hierarchical body of work while allowing production staff to:</w:t>
       </w:r>
       <w:r>
         <w:t xml:space="preserve"> </w:t>
@@ -122,37 +109,16 @@
           <w:rStyle w:val="SubtleEmphasis"/>
         </w:rPr>
       </w:pPr>
-      <w:proofErr w:type="spellStart"/>
       <w:r>
         <w:rPr>
           <w:rStyle w:val="SubtleEmphasis"/>
         </w:rPr>
-        <w:t>TaskForge</w:t>
-      </w:r>
-      <w:proofErr w:type="spellEnd"/>
-      <w:r>
-        <w:rPr>
-          <w:rStyle w:val="SubtleEmphasis"/>
-        </w:rPr>
-        <w:t xml:space="preserve"> System Overview</w:t>
-      </w:r>
-    </w:p>
-    <w:p>
-      <w:proofErr w:type="spellStart"/>
-      <w:r>
-        <w:t>TaskForge</w:t>
-      </w:r>
-      <w:proofErr w:type="spellEnd"/>
-      <w:r>
-        <w:t xml:space="preserve"> is a hierarchical work-processing system designed for managing the work involved in producing a film. A film production consists of many pieces of work that are organised into groups, such as production phases, scenes, and individual production tasks. </w:t>
-      </w:r>
-      <w:proofErr w:type="spellStart"/>
-      <w:r>
-        <w:t>TaskForge</w:t>
-      </w:r>
-      <w:proofErr w:type="spellEnd"/>
-      <w:r>
-        <w:t xml:space="preserve"> represents this work as a hierarchy in which both individual tasks and groups of tasks can be treated uniformly (composite DP).</w:t>
+        <w:t>TaskForge System Overview</w:t>
+      </w:r>
+    </w:p>
+    <w:p>
+      <w:r>
+        <w:t>TaskForge is a hierarchical work-processing system designed for managing the work involved in producing a film. A film production consists of many pieces of work that are organised into groups, such as production phases, scenes, and individual production tasks. TaskForge represents this work as a hierarchy in which both individual tasks and groups of tasks can be treated uniformly (composite DP).</w:t>
       </w:r>
     </w:p>
     <w:p>
@@ -225,22 +191,9 @@
       </w:r>
     </w:p>
     <w:p>
-      <w:proofErr w:type="spellStart"/>
       <w:r>
         <w:lastRenderedPageBreak/>
-        <w:t>TaskForge</w:t>
-      </w:r>
-      <w:proofErr w:type="spellEnd"/>
-      <w:r>
-        <w:t xml:space="preserve"> also allows additional responsibilities to be added to work items at runtime. For example, a safety check or equipment check can be added to a filming task without modifying the original task. These responsibilities can be stacked, allowing a single task to have multiple additional requirements while remaining usable through the same </w:t>
-      </w:r>
-      <w:proofErr w:type="spellStart"/>
-      <w:r>
-        <w:t>WorkItem</w:t>
-      </w:r>
-      <w:proofErr w:type="spellEnd"/>
-      <w:r>
-        <w:t xml:space="preserve"> abstraction</w:t>
+        <w:t>TaskForge also allows additional responsibilities to be added to work items at runtime. For example, a safety check or equipment check can be added to a filming task without modifying the original task. These responsibilities can be stacked, allowing a single task to have multiple additional requirements while remaining usable through the same WorkItem abstraction</w:t>
       </w:r>
       <w:r>
         <w:t xml:space="preserve"> (Decorator DP)</w:t>
@@ -251,15 +204,7 @@
     </w:p>
     <w:p>
       <w:r>
-        <w:t xml:space="preserve">Finally, the production hierarchy can change while the system is running. For example, a task can be moved from one scene or production group to another. </w:t>
-      </w:r>
-      <w:proofErr w:type="spellStart"/>
-      <w:r>
-        <w:t>TaskForge</w:t>
-      </w:r>
-      <w:proofErr w:type="spellEnd"/>
-      <w:r>
-        <w:t xml:space="preserve"> uses a deliberate </w:t>
+        <w:t xml:space="preserve">Finally, the production hierarchy can change while the system is running. For example, a task can be moved from one scene or production group to another. TaskForge uses a deliberate </w:t>
       </w:r>
       <w:r>
         <w:rPr>
@@ -273,15 +218,7 @@
     </w:p>
     <w:p>
       <w:r>
-        <w:t xml:space="preserve">Overall, </w:t>
-      </w:r>
-      <w:proofErr w:type="spellStart"/>
-      <w:r>
-        <w:t>TaskForge</w:t>
-      </w:r>
-      <w:proofErr w:type="spellEnd"/>
-      <w:r>
-        <w:t xml:space="preserve"> provides a single system for organising, traversing, processing, monitoring, and dynamically modifying film-production work. The Composite, Iterator, State, and Decorator patterns work together as parts of this single workflow rather than as separate demonstrations of the patterns.</w:t>
+        <w:t>Overall, TaskForge provides a single system for organising, traversing, processing, monitoring, and dynamically modifying film-production work. The Composite, Iterator, State, and Decorator patterns work together as parts of this single workflow rather than as separate demonstrations of the patterns.</w:t>
       </w:r>
     </w:p>
     <w:p/>
@@ -309,25 +246,7 @@
           <w:rFonts w:eastAsiaTheme="minorEastAsia"/>
           <w:spacing w:val="15"/>
         </w:rPr>
-        <w:t xml:space="preserve">fication of the </w:t>
-      </w:r>
-      <w:proofErr w:type="spellStart"/>
-      <w:r>
-        <w:rPr>
-          <w:rStyle w:val="SubtleEmphasis"/>
-          <w:rFonts w:eastAsiaTheme="minorEastAsia"/>
-          <w:spacing w:val="15"/>
-        </w:rPr>
-        <w:t>GoF</w:t>
-      </w:r>
-      <w:proofErr w:type="spellEnd"/>
-      <w:r>
-        <w:rPr>
-          <w:rStyle w:val="SubtleEmphasis"/>
-          <w:rFonts w:eastAsiaTheme="minorEastAsia"/>
-          <w:spacing w:val="15"/>
-        </w:rPr>
-        <w:t xml:space="preserve"> participants</w:t>
+        <w:t>fication of the GoF participants</w:t>
       </w:r>
     </w:p>
     <w:p>
@@ -385,14 +304,12 @@
                 <w:b w:val="0"/>
               </w:rPr>
             </w:pPr>
-            <w:proofErr w:type="spellStart"/>
             <w:r>
               <w:rPr>
                 <w:b w:val="0"/>
               </w:rPr>
               <w:t>WorkItem</w:t>
             </w:r>
-            <w:proofErr w:type="spellEnd"/>
           </w:p>
         </w:tc>
         <w:tc>
@@ -438,11 +355,9 @@
             <w:pPr>
               <w:cnfStyle w:val="000000100000" w:firstRow="0" w:lastRow="0" w:firstColumn="0" w:lastColumn="0" w:oddVBand="0" w:evenVBand="0" w:oddHBand="1" w:evenHBand="0" w:firstRowFirstColumn="0" w:firstRowLastColumn="0" w:lastRowFirstColumn="0" w:lastRowLastColumn="0"/>
             </w:pPr>
-            <w:proofErr w:type="spellStart"/>
             <w:r>
               <w:t>WorkGroup</w:t>
             </w:r>
-            <w:proofErr w:type="spellEnd"/>
           </w:p>
         </w:tc>
         <w:tc>
@@ -454,13 +369,8 @@
               <w:cnfStyle w:val="000000100000" w:firstRow="0" w:lastRow="0" w:firstColumn="0" w:lastColumn="0" w:oddVBand="0" w:evenVBand="0" w:oddHBand="1" w:evenHBand="0" w:firstRowFirstColumn="0" w:firstRowLastColumn="0" w:lastRowFirstColumn="0" w:lastRowLastColumn="0"/>
             </w:pPr>
             <w:r>
-              <w:t xml:space="preserve">Represents a group that contains other </w:t>
-            </w:r>
-            <w:proofErr w:type="spellStart"/>
-            <w:r>
-              <w:t>WorkItems</w:t>
-            </w:r>
-            <w:proofErr w:type="spellEnd"/>
+              <w:t>Represents a group that contains other WorkItems</w:t>
+            </w:r>
           </w:p>
         </w:tc>
       </w:tr>
@@ -484,11 +394,9 @@
             <w:pPr>
               <w:cnfStyle w:val="000000000000" w:firstRow="0" w:lastRow="0" w:firstColumn="0" w:lastColumn="0" w:oddVBand="0" w:evenVBand="0" w:oddHBand="0" w:evenHBand="0" w:firstRowFirstColumn="0" w:firstRowLastColumn="0" w:lastRowFirstColumn="0" w:lastRowLastColumn="0"/>
             </w:pPr>
-            <w:proofErr w:type="spellStart"/>
             <w:r>
               <w:t>ProductionTask</w:t>
             </w:r>
-            <w:proofErr w:type="spellEnd"/>
           </w:p>
         </w:tc>
         <w:tc>
@@ -528,11 +436,9 @@
             <w:pPr>
               <w:cnfStyle w:val="000000100000" w:firstRow="0" w:lastRow="0" w:firstColumn="0" w:lastColumn="0" w:oddVBand="0" w:evenVBand="0" w:oddHBand="1" w:evenHBand="0" w:firstRowFirstColumn="0" w:firstRowLastColumn="0" w:lastRowFirstColumn="0" w:lastRowLastColumn="0"/>
             </w:pPr>
-            <w:proofErr w:type="spellStart"/>
             <w:r>
               <w:t>ProductionPhase</w:t>
             </w:r>
-            <w:proofErr w:type="spellEnd"/>
             <w:r>
               <w:t>(Pre-Production, production, post-production)</w:t>
             </w:r>
@@ -540,39 +446,7 @@
               <w:t>, Scene</w:t>
             </w:r>
             <w:r>
-              <w:t xml:space="preserve"> (</w:t>
-            </w:r>
-            <w:proofErr w:type="spellStart"/>
-            <w:r>
-              <w:t>OpeningScene</w:t>
-            </w:r>
-            <w:proofErr w:type="spellEnd"/>
-            <w:r>
-              <w:t xml:space="preserve">, </w:t>
-            </w:r>
-            <w:proofErr w:type="spellStart"/>
-            <w:r>
-              <w:t>ClosingScene</w:t>
-            </w:r>
-            <w:proofErr w:type="spellEnd"/>
-            <w:r>
-              <w:t xml:space="preserve">, </w:t>
-            </w:r>
-            <w:proofErr w:type="spellStart"/>
-            <w:r>
-              <w:t>ClimaxScene</w:t>
-            </w:r>
-            <w:proofErr w:type="spellEnd"/>
-            <w:r>
-              <w:t xml:space="preserve">, </w:t>
-            </w:r>
-            <w:proofErr w:type="spellStart"/>
-            <w:r>
-              <w:t>postClimaxScene</w:t>
-            </w:r>
-            <w:proofErr w:type="spellEnd"/>
-            <w:r>
-              <w:t>)</w:t>
+              <w:t xml:space="preserve"> (OpeningScene, ClosingScene, ClimaxScene, postClimaxScene)</w:t>
             </w:r>
           </w:p>
         </w:tc>
@@ -639,11 +513,9 @@
             <w:pPr>
               <w:cnfStyle w:val="100000000000" w:firstRow="1" w:lastRow="0" w:firstColumn="0" w:lastColumn="0" w:oddVBand="0" w:evenVBand="0" w:oddHBand="0" w:evenHBand="0" w:firstRowFirstColumn="0" w:firstRowLastColumn="0" w:lastRowFirstColumn="0" w:lastRowLastColumn="0"/>
             </w:pPr>
-            <w:proofErr w:type="spellStart"/>
             <w:r>
               <w:t>WorkIterator</w:t>
             </w:r>
-            <w:proofErr w:type="spellEnd"/>
           </w:p>
         </w:tc>
         <w:tc>
@@ -683,11 +555,9 @@
             <w:pPr>
               <w:cnfStyle w:val="000000100000" w:firstRow="0" w:lastRow="0" w:firstColumn="0" w:lastColumn="0" w:oddVBand="0" w:evenVBand="0" w:oddHBand="1" w:evenHBand="0" w:firstRowFirstColumn="0" w:firstRowLastColumn="0" w:lastRowFirstColumn="0" w:lastRowLastColumn="0"/>
             </w:pPr>
-            <w:proofErr w:type="spellStart"/>
             <w:r>
               <w:t>ProductionOrderIterator</w:t>
             </w:r>
-            <w:proofErr w:type="spellEnd"/>
           </w:p>
         </w:tc>
         <w:tc>
@@ -727,11 +597,9 @@
             <w:pPr>
               <w:cnfStyle w:val="000000000000" w:firstRow="0" w:lastRow="0" w:firstColumn="0" w:lastColumn="0" w:oddVBand="0" w:evenVBand="0" w:oddHBand="0" w:evenHBand="0" w:firstRowFirstColumn="0" w:firstRowLastColumn="0" w:lastRowFirstColumn="0" w:lastRowLastColumn="0"/>
             </w:pPr>
-            <w:proofErr w:type="spellStart"/>
             <w:r>
               <w:t>PriorityIterator</w:t>
             </w:r>
-            <w:proofErr w:type="spellEnd"/>
           </w:p>
         </w:tc>
         <w:tc>
@@ -771,19 +639,9 @@
             <w:pPr>
               <w:cnfStyle w:val="000000100000" w:firstRow="0" w:lastRow="0" w:firstColumn="0" w:lastColumn="0" w:oddVBand="0" w:evenVBand="0" w:oddHBand="1" w:evenHBand="0" w:firstRowFirstColumn="0" w:firstRowLastColumn="0" w:lastRowFirstColumn="0" w:lastRowLastColumn="0"/>
             </w:pPr>
-            <w:proofErr w:type="spellStart"/>
-            <w:r>
-              <w:t>WorkItem</w:t>
-            </w:r>
-            <w:proofErr w:type="spellEnd"/>
-            <w:r>
-              <w:t xml:space="preserve">/ </w:t>
-            </w:r>
-            <w:proofErr w:type="spellStart"/>
-            <w:r>
-              <w:t>WorkGroup</w:t>
-            </w:r>
-            <w:proofErr w:type="spellEnd"/>
+            <w:r>
+              <w:t>WorkItem/ WorkGroup</w:t>
+            </w:r>
           </w:p>
         </w:tc>
         <w:tc>
@@ -853,11 +711,9 @@
             <w:pPr>
               <w:cnfStyle w:val="100000000000" w:firstRow="1" w:lastRow="0" w:firstColumn="0" w:lastColumn="0" w:oddVBand="0" w:evenVBand="0" w:oddHBand="0" w:evenHBand="0" w:firstRowFirstColumn="0" w:firstRowLastColumn="0" w:lastRowFirstColumn="0" w:lastRowLastColumn="0"/>
             </w:pPr>
-            <w:proofErr w:type="spellStart"/>
             <w:r>
               <w:t>ProductionTask</w:t>
             </w:r>
-            <w:proofErr w:type="spellEnd"/>
           </w:p>
         </w:tc>
         <w:tc>
@@ -897,11 +753,9 @@
             <w:pPr>
               <w:cnfStyle w:val="000000100000" w:firstRow="0" w:lastRow="0" w:firstColumn="0" w:lastColumn="0" w:oddVBand="0" w:evenVBand="0" w:oddHBand="1" w:evenHBand="0" w:firstRowFirstColumn="0" w:firstRowLastColumn="0" w:lastRowFirstColumn="0" w:lastRowLastColumn="0"/>
             </w:pPr>
-            <w:proofErr w:type="spellStart"/>
             <w:r>
               <w:t>TaskState</w:t>
             </w:r>
-            <w:proofErr w:type="spellEnd"/>
           </w:p>
         </w:tc>
         <w:tc>
@@ -925,11 +779,9 @@
             <w:tcW w:w="3000" w:type="dxa"/>
           </w:tcPr>
           <w:p>
-            <w:proofErr w:type="spellStart"/>
             <w:r>
               <w:t>ConcreteState</w:t>
             </w:r>
-            <w:proofErr w:type="spellEnd"/>
           </w:p>
         </w:tc>
         <w:tc>
@@ -1013,11 +865,9 @@
             <w:pPr>
               <w:cnfStyle w:val="100000000000" w:firstRow="1" w:lastRow="0" w:firstColumn="0" w:lastColumn="0" w:oddVBand="0" w:evenVBand="0" w:oddHBand="0" w:evenHBand="0" w:firstRowFirstColumn="0" w:firstRowLastColumn="0" w:lastRowFirstColumn="0" w:lastRowLastColumn="0"/>
             </w:pPr>
-            <w:proofErr w:type="spellStart"/>
             <w:r>
               <w:t>WorkItem</w:t>
             </w:r>
-            <w:proofErr w:type="spellEnd"/>
           </w:p>
         </w:tc>
         <w:tc>
@@ -1060,53 +910,11 @@
             <w:pPr>
               <w:cnfStyle w:val="000000100000" w:firstRow="0" w:lastRow="0" w:firstColumn="0" w:lastColumn="0" w:oddVBand="0" w:evenVBand="0" w:oddHBand="1" w:evenHBand="0" w:firstRowFirstColumn="0" w:firstRowLastColumn="0" w:lastRowFirstColumn="0" w:lastRowLastColumn="0"/>
             </w:pPr>
-            <w:proofErr w:type="spellStart"/>
             <w:r>
               <w:t>ProductionTask</w:t>
             </w:r>
-            <w:proofErr w:type="spellEnd"/>
-            <w:r>
-              <w:t xml:space="preserve"> (</w:t>
-            </w:r>
-            <w:proofErr w:type="spellStart"/>
-            <w:r>
-              <w:t>castLead</w:t>
-            </w:r>
-            <w:proofErr w:type="spellEnd"/>
-            <w:r>
-              <w:t xml:space="preserve">, </w:t>
-            </w:r>
-            <w:proofErr w:type="spellStart"/>
-            <w:r>
-              <w:t>findLocation</w:t>
-            </w:r>
-            <w:proofErr w:type="spellEnd"/>
-            <w:r>
-              <w:t xml:space="preserve">, </w:t>
-            </w:r>
-            <w:proofErr w:type="spellStart"/>
-            <w:r>
-              <w:t>filmScene</w:t>
-            </w:r>
-            <w:proofErr w:type="spellEnd"/>
-            <w:r>
-              <w:t xml:space="preserve">, </w:t>
-            </w:r>
-            <w:proofErr w:type="spellStart"/>
-            <w:r>
-              <w:t>editScene</w:t>
-            </w:r>
-            <w:proofErr w:type="spellEnd"/>
-            <w:r>
-              <w:t xml:space="preserve">, </w:t>
-            </w:r>
-            <w:proofErr w:type="spellStart"/>
-            <w:r>
-              <w:t>addEffects</w:t>
-            </w:r>
-            <w:proofErr w:type="spellEnd"/>
-            <w:r>
-              <w:t>)</w:t>
+            <w:r>
+              <w:t xml:space="preserve"> (castLead, findLocation, filmScene, editScene, addEffects)</w:t>
             </w:r>
           </w:p>
         </w:tc>
@@ -1144,11 +952,9 @@
             <w:pPr>
               <w:cnfStyle w:val="000000000000" w:firstRow="0" w:lastRow="0" w:firstColumn="0" w:lastColumn="0" w:oddVBand="0" w:evenVBand="0" w:oddHBand="0" w:evenHBand="0" w:firstRowFirstColumn="0" w:firstRowLastColumn="0" w:lastRowFirstColumn="0" w:lastRowLastColumn="0"/>
             </w:pPr>
-            <w:proofErr w:type="spellStart"/>
             <w:r>
               <w:t>WorkItemDecorator</w:t>
             </w:r>
-            <w:proofErr w:type="spellEnd"/>
           </w:p>
         </w:tc>
         <w:tc>
@@ -1160,13 +966,8 @@
               <w:cnfStyle w:val="000000000000" w:firstRow="0" w:lastRow="0" w:firstColumn="0" w:lastColumn="0" w:oddVBand="0" w:evenVBand="0" w:oddHBand="0" w:evenHBand="0" w:firstRowFirstColumn="0" w:firstRowLastColumn="0" w:lastRowFirstColumn="0" w:lastRowLastColumn="0"/>
             </w:pPr>
             <w:r>
-              <w:t xml:space="preserve">Base wrapper implementing </w:t>
-            </w:r>
-            <w:proofErr w:type="spellStart"/>
-            <w:r>
-              <w:t>WorkItem</w:t>
-            </w:r>
-            <w:proofErr w:type="spellEnd"/>
+              <w:t>Base wrapper implementing WorkItem</w:t>
+            </w:r>
           </w:p>
         </w:tc>
       </w:tr>
@@ -1180,11 +981,9 @@
             <w:tcW w:w="3116" w:type="dxa"/>
           </w:tcPr>
           <w:p>
-            <w:proofErr w:type="spellStart"/>
             <w:r>
               <w:t>ConcreteDecorator</w:t>
             </w:r>
-            <w:proofErr w:type="spellEnd"/>
           </w:p>
         </w:tc>
         <w:tc>
@@ -1195,21 +994,14 @@
             <w:pPr>
               <w:cnfStyle w:val="000000100000" w:firstRow="0" w:lastRow="0" w:firstColumn="0" w:lastColumn="0" w:oddVBand="0" w:evenVBand="0" w:oddHBand="1" w:evenHBand="0" w:firstRowFirstColumn="0" w:firstRowLastColumn="0" w:lastRowFirstColumn="0" w:lastRowLastColumn="0"/>
             </w:pPr>
-            <w:proofErr w:type="spellStart"/>
             <w:r>
               <w:t>SafetyCheck</w:t>
             </w:r>
-            <w:proofErr w:type="spellEnd"/>
             <w:r>
               <w:t xml:space="preserve">, </w:t>
             </w:r>
-            <w:proofErr w:type="spellStart"/>
-            <w:r>
-              <w:t>EquipementCheck</w:t>
-            </w:r>
-            <w:proofErr w:type="spellEnd"/>
-            <w:r>
-              <w:t>, Insurance</w:t>
+            <w:r>
+              <w:t>EquipementCheck, Insurance</w:t>
             </w:r>
           </w:p>
         </w:tc>
@@ -1264,49 +1056,13 @@
         </w:rPr>
       </w:pPr>
       <w:r>
-        <w:t xml:space="preserve">Composite: </w:t>
-      </w:r>
-      <w:proofErr w:type="spellStart"/>
-      <w:r>
-        <w:t>WorkItem</w:t>
-      </w:r>
-      <w:proofErr w:type="spellEnd"/>
-      <w:r>
-        <w:t xml:space="preserve"> </w:t>
-      </w:r>
-      <w:r>
-        <w:rPr>
-          <w:rFonts w:cstheme="minorHAnsi"/>
-        </w:rPr>
-        <w:t xml:space="preserve">← </w:t>
-      </w:r>
-      <w:proofErr w:type="spellStart"/>
-      <w:r>
-        <w:rPr>
-          <w:rFonts w:cstheme="minorHAnsi"/>
-        </w:rPr>
-        <w:t>ProductionTask</w:t>
-      </w:r>
-      <w:proofErr w:type="spellEnd"/>
-      <w:r>
-        <w:rPr>
-          <w:rFonts w:cstheme="minorHAnsi"/>
-        </w:rPr>
-        <w:t xml:space="preserve">, </w:t>
-      </w:r>
-      <w:proofErr w:type="spellStart"/>
-      <w:r>
-        <w:rPr>
-          <w:rFonts w:cstheme="minorHAnsi"/>
-        </w:rPr>
-        <w:t>WorkGroup</w:t>
-      </w:r>
-      <w:proofErr w:type="spellEnd"/>
-      <w:r>
-        <w:rPr>
-          <w:rFonts w:cstheme="minorHAnsi"/>
-        </w:rPr>
-        <w:t xml:space="preserve"> </w:t>
+        <w:t xml:space="preserve">Composite: WorkItem </w:t>
+      </w:r>
+      <w:r>
+        <w:rPr>
+          <w:rFonts w:cstheme="minorHAnsi"/>
+        </w:rPr>
+        <w:t xml:space="preserve">← ProductionTask, WorkGroup </w:t>
       </w:r>
       <w:r>
         <w:rPr>
@@ -1318,48 +1074,20 @@
         <w:rPr>
           <w:rFonts w:cstheme="minorHAnsi"/>
         </w:rPr>
-        <w:t xml:space="preserve"> </w:t>
-      </w:r>
-      <w:proofErr w:type="spellStart"/>
-      <w:r>
-        <w:rPr>
-          <w:rFonts w:cstheme="minorHAnsi"/>
-        </w:rPr>
-        <w:t>ProductionPhase</w:t>
-      </w:r>
-      <w:proofErr w:type="spellEnd"/>
-      <w:r>
-        <w:rPr>
-          <w:rFonts w:cstheme="minorHAnsi"/>
-        </w:rPr>
-        <w:t>, Scene</w:t>
-      </w:r>
-    </w:p>
-    <w:p>
-      <w:pPr>
-        <w:rPr>
-          <w:rFonts w:cstheme="minorHAnsi"/>
-        </w:rPr>
-      </w:pPr>
-      <w:r>
-        <w:rPr>
-          <w:rFonts w:cstheme="minorHAnsi"/>
-        </w:rPr>
-        <w:t xml:space="preserve">Iterator: </w:t>
-      </w:r>
-      <w:proofErr w:type="spellStart"/>
-      <w:r>
-        <w:rPr>
-          <w:rFonts w:cstheme="minorHAnsi"/>
-        </w:rPr>
-        <w:t>WorkIterator</w:t>
-      </w:r>
-      <w:proofErr w:type="spellEnd"/>
-      <w:r>
-        <w:rPr>
-          <w:rFonts w:cstheme="minorHAnsi"/>
-        </w:rPr>
-        <w:t xml:space="preserve"> </w:t>
+        <w:t xml:space="preserve"> ProductionPhase, Scene</w:t>
+      </w:r>
+    </w:p>
+    <w:p>
+      <w:pPr>
+        <w:rPr>
+          <w:rFonts w:cstheme="minorHAnsi"/>
+        </w:rPr>
+      </w:pPr>
+      <w:r>
+        <w:rPr>
+          <w:rFonts w:cstheme="minorHAnsi"/>
+        </w:rPr>
+        <w:t xml:space="preserve">Iterator: WorkIterator </w:t>
       </w:r>
       <w:r>
         <w:rPr>
@@ -1371,30 +1099,8 @@
         <w:rPr>
           <w:rFonts w:cstheme="minorHAnsi"/>
         </w:rPr>
-        <w:t xml:space="preserve"> </w:t>
-      </w:r>
-      <w:proofErr w:type="spellStart"/>
-      <w:r>
-        <w:rPr>
-          <w:rFonts w:cstheme="minorHAnsi"/>
-        </w:rPr>
-        <w:t>ProductionOrderIterator</w:t>
-      </w:r>
-      <w:proofErr w:type="spellEnd"/>
-      <w:r>
-        <w:rPr>
-          <w:rFonts w:cstheme="minorHAnsi"/>
-        </w:rPr>
-        <w:t xml:space="preserve">, </w:t>
-      </w:r>
-      <w:proofErr w:type="spellStart"/>
-      <w:r>
-        <w:rPr>
-          <w:rFonts w:cstheme="minorHAnsi"/>
-        </w:rPr>
-        <w:t>PriorityIterator</w:t>
-      </w:r>
-      <w:proofErr w:type="spellEnd"/>
+        <w:t xml:space="preserve"> ProductionOrderIterator, PriorityIterator</w:t>
+      </w:r>
     </w:p>
     <w:p>
       <w:pPr>
@@ -1431,21 +1137,7 @@
         <w:rPr>
           <w:rFonts w:cstheme="minorHAnsi"/>
         </w:rPr>
-        <w:t xml:space="preserve">Decorator: </w:t>
-      </w:r>
-      <w:proofErr w:type="spellStart"/>
-      <w:r>
-        <w:rPr>
-          <w:rFonts w:cstheme="minorHAnsi"/>
-        </w:rPr>
-        <w:t>WorkItem</w:t>
-      </w:r>
-      <w:proofErr w:type="spellEnd"/>
-      <w:r>
-        <w:rPr>
-          <w:rFonts w:cstheme="minorHAnsi"/>
-        </w:rPr>
-        <w:t xml:space="preserve"> </w:t>
+        <w:t xml:space="preserve">Decorator: WorkItem </w:t>
       </w:r>
       <w:r>
         <w:rPr>
@@ -1457,21 +1149,7 @@
         <w:rPr>
           <w:rFonts w:cstheme="minorHAnsi"/>
         </w:rPr>
-        <w:t xml:space="preserve"> </w:t>
-      </w:r>
-      <w:proofErr w:type="spellStart"/>
-      <w:r>
-        <w:rPr>
-          <w:rFonts w:cstheme="minorHAnsi"/>
-        </w:rPr>
-        <w:t>WorkItemDecorator</w:t>
-      </w:r>
-      <w:proofErr w:type="spellEnd"/>
-      <w:r>
-        <w:rPr>
-          <w:rFonts w:cstheme="minorHAnsi"/>
-        </w:rPr>
-        <w:t xml:space="preserve"> </w:t>
+        <w:t xml:space="preserve"> WorkItemDecorator </w:t>
       </w:r>
       <w:r>
         <w:rPr>
@@ -1483,30 +1161,8 @@
         <w:rPr>
           <w:rFonts w:cstheme="minorHAnsi"/>
         </w:rPr>
-        <w:t xml:space="preserve"> </w:t>
-      </w:r>
-      <w:proofErr w:type="spellStart"/>
-      <w:r>
-        <w:rPr>
-          <w:rFonts w:cstheme="minorHAnsi"/>
-        </w:rPr>
-        <w:t>SafetyCheckDecorator</w:t>
-      </w:r>
-      <w:proofErr w:type="spellEnd"/>
-      <w:r>
-        <w:rPr>
-          <w:rFonts w:cstheme="minorHAnsi"/>
-        </w:rPr>
-        <w:t xml:space="preserve">, </w:t>
-      </w:r>
-      <w:proofErr w:type="spellStart"/>
-      <w:r>
-        <w:rPr>
-          <w:rFonts w:cstheme="minorHAnsi"/>
-        </w:rPr>
-        <w:t>EquipmentCheckDecorator</w:t>
-      </w:r>
-      <w:proofErr w:type="spellEnd"/>
+        <w:t xml:space="preserve"> SafetyCheckDecorator, EquipmentCheckDecorator</w:t>
+      </w:r>
     </w:p>
     <w:p>
       <w:pPr>
@@ -1544,45 +1200,55 @@
           <w:b/>
           <w:i/>
         </w:rPr>
-        <w:t xml:space="preserve">Why use </w:t>
-      </w:r>
-      <w:proofErr w:type="spellStart"/>
+        <w:t>Why use WorkItem?</w:t>
+      </w:r>
+      <w:r>
+        <w:rPr>
+          <w:rFonts w:cstheme="minorHAnsi"/>
+        </w:rPr>
+        <w:t xml:space="preserve"> WorkItem provides a common abstraction for both individual production tasks and groups of work. This allows the Composite pattern to treat individual and grouped work uniformly.</w:t>
+      </w:r>
+    </w:p>
+    <w:p>
+      <w:pPr>
+        <w:rPr>
+          <w:rFonts w:cstheme="minorHAnsi"/>
+        </w:rPr>
+      </w:pPr>
       <w:r>
         <w:rPr>
           <w:rFonts w:cstheme="minorHAnsi"/>
           <w:b/>
           <w:i/>
         </w:rPr>
-        <w:t>WorkItem</w:t>
-      </w:r>
-      <w:proofErr w:type="spellEnd"/>
+        <w:t>Why use WorkGroup?</w:t>
+      </w:r>
+      <w:r>
+        <w:rPr>
+          <w:rFonts w:cstheme="minorHAnsi"/>
+        </w:rPr>
+        <w:t xml:space="preserve"> Film production naturally consists of recursively nested groups. WorkGroup allows a group to contain other WorkItems, creating the required hierarchical structure.</w:t>
+      </w:r>
+    </w:p>
+    <w:p>
+      <w:pPr>
+        <w:rPr>
+          <w:rFonts w:cstheme="minorHAnsi"/>
+        </w:rPr>
+      </w:pPr>
       <w:r>
         <w:rPr>
           <w:rFonts w:cstheme="minorHAnsi"/>
           <w:b/>
           <w:i/>
         </w:rPr>
-        <w:t>?</w:t>
-      </w:r>
-      <w:r>
-        <w:rPr>
-          <w:rFonts w:cstheme="minorHAnsi"/>
-        </w:rPr>
-        <w:t xml:space="preserve"> </w:t>
-      </w:r>
-      <w:proofErr w:type="spellStart"/>
-      <w:r>
-        <w:rPr>
-          <w:rFonts w:cstheme="minorHAnsi"/>
-        </w:rPr>
-        <w:t>WorkItem</w:t>
-      </w:r>
-      <w:proofErr w:type="spellEnd"/>
-      <w:r>
-        <w:rPr>
-          <w:rFonts w:cstheme="minorHAnsi"/>
-        </w:rPr>
-        <w:t xml:space="preserve"> provides a common abstraction for both individual production tasks and groups of work. This allows the Composite pattern to treat individual and grouped work uniformly.</w:t>
+        <w:t>Why use ProductionPhase and Scene?</w:t>
+      </w:r>
+      <w:r>
+        <w:rPr>
+          <w:rFonts w:cstheme="minorHAnsi"/>
+        </w:rPr>
+        <w:t xml:space="preserve"> These provide concrete domain meaning to the composite hierarchy instead of creating a generic tree with no connection to the film-production problem.</w:t>
       </w:r>
     </w:p>
     <w:p>
@@ -1597,59 +1263,62 @@
           <w:b/>
           <w:i/>
         </w:rPr>
-        <w:t xml:space="preserve">Why use </w:t>
-      </w:r>
-      <w:proofErr w:type="spellStart"/>
+        <w:t>Why use two iterators?</w:t>
+      </w:r>
+      <w:r>
+        <w:rPr>
+          <w:rFonts w:cstheme="minorHAnsi"/>
+        </w:rPr>
+        <w:t xml:space="preserve"> Different users may need different views of the same production. ProductionOrderIterator follows the production hierarchy, while PriorityIterator identifies the most </w:t>
+      </w:r>
+      <w:r>
+        <w:rPr>
+          <w:rFonts w:cstheme="minorHAnsi"/>
+        </w:rPr>
+        <w:lastRenderedPageBreak/>
+        <w:t>important tasks first. This gives the Iterator pattern a genuine purpose rather than simply replacing an STL loop.</w:t>
+      </w:r>
+    </w:p>
+    <w:p>
+      <w:pPr>
+        <w:rPr>
+          <w:rFonts w:cstheme="minorHAnsi"/>
+        </w:rPr>
+      </w:pPr>
       <w:r>
         <w:rPr>
           <w:rFonts w:cstheme="minorHAnsi"/>
           <w:b/>
           <w:i/>
         </w:rPr>
-        <w:t>WorkGroup</w:t>
-      </w:r>
-      <w:proofErr w:type="spellEnd"/>
+        <w:t>Why use State?</w:t>
+      </w:r>
+      <w:r>
+        <w:rPr>
+          <w:rFonts w:cstheme="minorHAnsi"/>
+        </w:rPr>
+        <w:t xml:space="preserve"> A production task naturally changes throughout its lifecycle. The State pattern lets a task behave differently when planned, in progress, blocked or completed, while also preventing invalid lifecycle transitions.</w:t>
+      </w:r>
+    </w:p>
+    <w:p>
+      <w:pPr>
+        <w:rPr>
+          <w:rFonts w:cstheme="minorHAnsi"/>
+        </w:rPr>
+      </w:pPr>
       <w:r>
         <w:rPr>
           <w:rFonts w:cstheme="minorHAnsi"/>
           <w:b/>
           <w:i/>
         </w:rPr>
-        <w:t>?</w:t>
-      </w:r>
-      <w:r>
-        <w:rPr>
-          <w:rFonts w:cstheme="minorHAnsi"/>
-        </w:rPr>
-        <w:t xml:space="preserve"> Film production naturally consists of recursively nested groups. </w:t>
-      </w:r>
-      <w:proofErr w:type="spellStart"/>
-      <w:r>
-        <w:rPr>
-          <w:rFonts w:cstheme="minorHAnsi"/>
-        </w:rPr>
-        <w:t>WorkGroup</w:t>
-      </w:r>
-      <w:proofErr w:type="spellEnd"/>
-      <w:r>
-        <w:rPr>
-          <w:rFonts w:cstheme="minorHAnsi"/>
-        </w:rPr>
-        <w:t xml:space="preserve"> allows a group to contain other </w:t>
-      </w:r>
-      <w:proofErr w:type="spellStart"/>
-      <w:r>
-        <w:rPr>
-          <w:rFonts w:cstheme="minorHAnsi"/>
-        </w:rPr>
-        <w:t>WorkItems</w:t>
-      </w:r>
-      <w:proofErr w:type="spellEnd"/>
-      <w:r>
-        <w:rPr>
-          <w:rFonts w:cstheme="minorHAnsi"/>
-        </w:rPr>
-        <w:t>, creating the required hierarchical structure.</w:t>
+        <w:t>Why use Decorator?</w:t>
+      </w:r>
+      <w:r>
+        <w:rPr>
+          <w:rFonts w:cstheme="minorHAnsi"/>
+        </w:rPr>
+        <w:t xml:space="preserve"> Some production tasks require additional responsibilities only in particular circumstances. Safety checks and equipment checks can therefore be added dynamically without modifying ProductionTask.</w:t>
       </w:r>
     </w:p>
     <w:p>
@@ -1664,256 +1333,55 @@
           <w:b/>
           <w:i/>
         </w:rPr>
-        <w:t xml:space="preserve">Why use </w:t>
-      </w:r>
-      <w:proofErr w:type="spellStart"/>
+        <w:t>Why are decorators non-owning?</w:t>
+      </w:r>
+      <w:r>
+        <w:rPr>
+          <w:rFonts w:cstheme="minorHAnsi"/>
+        </w:rPr>
+        <w:t xml:space="preserve"> The production hierarchy should have one clear owner for each work item. Making decorators non-owning prevents ownership conflicts and ensures that the hierarchy remains responsible for the lifetime of the underlying work item.</w:t>
+      </w:r>
+    </w:p>
+    <w:p>
+      <w:pPr>
+        <w:rPr>
+          <w:rFonts w:cstheme="minorHAnsi"/>
+        </w:rPr>
+      </w:pPr>
       <w:r>
         <w:rPr>
           <w:rFonts w:cstheme="minorHAnsi"/>
           <w:b/>
           <w:i/>
         </w:rPr>
-        <w:t>ProductionPhase</w:t>
-      </w:r>
-      <w:proofErr w:type="spellEnd"/>
+        <w:t>Why use composition for WorkGroup → WorkItem?</w:t>
+      </w:r>
+      <w:r>
+        <w:rPr>
+          <w:rFonts w:cstheme="minorHAnsi"/>
+        </w:rPr>
+        <w:t xml:space="preserve"> The group owns the work items within it. This gives the system a clear destruction policy and makes the recursive hierarchy straightforward to manage.</w:t>
+      </w:r>
+    </w:p>
+    <w:p>
+      <w:pPr>
+        <w:rPr>
+          <w:rFonts w:cstheme="minorHAnsi"/>
+        </w:rPr>
+      </w:pPr>
       <w:r>
         <w:rPr>
           <w:rFonts w:cstheme="minorHAnsi"/>
           <w:b/>
           <w:i/>
         </w:rPr>
-        <w:t xml:space="preserve"> and Scene?</w:t>
-      </w:r>
-      <w:r>
-        <w:rPr>
-          <w:rFonts w:cstheme="minorHAnsi"/>
-        </w:rPr>
-        <w:t xml:space="preserve"> These provide concrete domain meaning to the composite hierarchy instead of creating a generic tree with no connection to the film-production problem.</w:t>
-      </w:r>
-    </w:p>
-    <w:p>
-      <w:pPr>
-        <w:rPr>
-          <w:rFonts w:cstheme="minorHAnsi"/>
-        </w:rPr>
-      </w:pPr>
-      <w:r>
-        <w:rPr>
-          <w:rFonts w:cstheme="minorHAnsi"/>
-          <w:b/>
-          <w:i/>
-        </w:rPr>
-        <w:t>Why use two iterators?</w:t>
-      </w:r>
-      <w:r>
-        <w:rPr>
-          <w:rFonts w:cstheme="minorHAnsi"/>
-        </w:rPr>
-        <w:t xml:space="preserve"> Different users may need different views of the same production. </w:t>
-      </w:r>
-      <w:proofErr w:type="spellStart"/>
-      <w:r>
-        <w:rPr>
-          <w:rFonts w:cstheme="minorHAnsi"/>
-        </w:rPr>
-        <w:t>ProductionOrderIterator</w:t>
-      </w:r>
-      <w:proofErr w:type="spellEnd"/>
-      <w:r>
-        <w:rPr>
-          <w:rFonts w:cstheme="minorHAnsi"/>
-        </w:rPr>
-        <w:t xml:space="preserve"> follows the production hierarchy, while </w:t>
-      </w:r>
-      <w:proofErr w:type="spellStart"/>
-      <w:r>
-        <w:rPr>
-          <w:rFonts w:cstheme="minorHAnsi"/>
-        </w:rPr>
-        <w:t>PriorityIterator</w:t>
-      </w:r>
-      <w:proofErr w:type="spellEnd"/>
-      <w:r>
-        <w:rPr>
-          <w:rFonts w:cstheme="minorHAnsi"/>
-        </w:rPr>
-        <w:t xml:space="preserve"> identifies the most </w:t>
-      </w:r>
-      <w:r>
-        <w:rPr>
-          <w:rFonts w:cstheme="minorHAnsi"/>
-        </w:rPr>
-        <w:lastRenderedPageBreak/>
-        <w:t>important tasks first. This gives the Iterator pattern a genuine purpose rather than simply replacing an STL loop.</w:t>
-      </w:r>
-    </w:p>
-    <w:p>
-      <w:pPr>
-        <w:rPr>
-          <w:rFonts w:cstheme="minorHAnsi"/>
-        </w:rPr>
-      </w:pPr>
-      <w:r>
-        <w:rPr>
-          <w:rFonts w:cstheme="minorHAnsi"/>
-          <w:b/>
-          <w:i/>
-        </w:rPr>
-        <w:t>Why use State?</w:t>
-      </w:r>
-      <w:r>
-        <w:rPr>
-          <w:rFonts w:cstheme="minorHAnsi"/>
-        </w:rPr>
-        <w:t xml:space="preserve"> A production task naturally changes throughout its lifecycle. The State pattern lets a task behave differently when planned, in progress, blocked or completed, while also preventing invalid lifecycle transitions.</w:t>
-      </w:r>
-    </w:p>
-    <w:p>
-      <w:pPr>
-        <w:rPr>
-          <w:rFonts w:cstheme="minorHAnsi"/>
-        </w:rPr>
-      </w:pPr>
-      <w:r>
-        <w:rPr>
-          <w:rFonts w:cstheme="minorHAnsi"/>
-          <w:b/>
-          <w:i/>
-        </w:rPr>
-        <w:t>Why use Decorator?</w:t>
-      </w:r>
-      <w:r>
-        <w:rPr>
-          <w:rFonts w:cstheme="minorHAnsi"/>
-        </w:rPr>
-        <w:t xml:space="preserve"> Some production tasks require additional responsibilities only in particular circumstances. Safety checks and equipment checks can therefore be added dynamically without modifying </w:t>
-      </w:r>
-      <w:proofErr w:type="spellStart"/>
-      <w:r>
-        <w:rPr>
-          <w:rFonts w:cstheme="minorHAnsi"/>
-        </w:rPr>
-        <w:t>ProductionTask</w:t>
-      </w:r>
-      <w:proofErr w:type="spellEnd"/>
-      <w:r>
-        <w:rPr>
-          <w:rFonts w:cstheme="minorHAnsi"/>
-        </w:rPr>
-        <w:t>.</w:t>
-      </w:r>
-    </w:p>
-    <w:p>
-      <w:pPr>
-        <w:rPr>
-          <w:rFonts w:cstheme="minorHAnsi"/>
-        </w:rPr>
-      </w:pPr>
-      <w:r>
-        <w:rPr>
-          <w:rFonts w:cstheme="minorHAnsi"/>
-          <w:b/>
-          <w:i/>
-        </w:rPr>
-        <w:t>Why are decorators non-owning?</w:t>
-      </w:r>
-      <w:r>
-        <w:rPr>
-          <w:rFonts w:cstheme="minorHAnsi"/>
-        </w:rPr>
-        <w:t xml:space="preserve"> The production hierarchy should have one clear owner for each work item. Making decorators non-owning prevents ownership conflicts and ensures that the hierarchy remains responsible for the lifetime of the underlying work item.</w:t>
-      </w:r>
-    </w:p>
-    <w:p>
-      <w:pPr>
-        <w:rPr>
-          <w:rFonts w:cstheme="minorHAnsi"/>
-        </w:rPr>
-      </w:pPr>
-      <w:r>
-        <w:rPr>
-          <w:rFonts w:cstheme="minorHAnsi"/>
-          <w:b/>
-          <w:i/>
-        </w:rPr>
-        <w:t xml:space="preserve">Why use composition for </w:t>
-      </w:r>
-      <w:proofErr w:type="spellStart"/>
-      <w:r>
-        <w:rPr>
-          <w:rFonts w:cstheme="minorHAnsi"/>
-          <w:b/>
-          <w:i/>
-        </w:rPr>
-        <w:t>WorkGroup</w:t>
-      </w:r>
-      <w:proofErr w:type="spellEnd"/>
-      <w:r>
-        <w:rPr>
-          <w:rFonts w:cstheme="minorHAnsi"/>
-          <w:b/>
-          <w:i/>
-        </w:rPr>
-        <w:t xml:space="preserve"> → </w:t>
-      </w:r>
-      <w:proofErr w:type="spellStart"/>
-      <w:r>
-        <w:rPr>
-          <w:rFonts w:cstheme="minorHAnsi"/>
-          <w:b/>
-          <w:i/>
-        </w:rPr>
-        <w:t>WorkItem</w:t>
-      </w:r>
-      <w:proofErr w:type="spellEnd"/>
-      <w:r>
-        <w:rPr>
-          <w:rFonts w:cstheme="minorHAnsi"/>
-          <w:b/>
-          <w:i/>
-        </w:rPr>
-        <w:t>?</w:t>
-      </w:r>
-      <w:r>
-        <w:rPr>
-          <w:rFonts w:cstheme="minorHAnsi"/>
-        </w:rPr>
-        <w:t xml:space="preserve"> The group owns the work items within it. This gives the system a clear destruction policy and makes the recursive hierarchy straightforward to manage.</w:t>
-      </w:r>
-    </w:p>
-    <w:p>
-      <w:pPr>
-        <w:rPr>
-          <w:rFonts w:cstheme="minorHAnsi"/>
-        </w:rPr>
-      </w:pPr>
-      <w:r>
-        <w:rPr>
-          <w:rFonts w:cstheme="minorHAnsi"/>
-          <w:b/>
-          <w:i/>
-        </w:rPr>
         <w:t>How we keep the design relatively small?</w:t>
       </w:r>
       <w:r>
         <w:rPr>
           <w:rFonts w:cstheme="minorHAnsi"/>
         </w:rPr>
-        <w:t xml:space="preserve"> Since we are advised to keep the design relatively small, we deliberately do not model cameras, budgets, contracts, crew members, costumes, etc. as separate systems. They can appear as the subject of tasks, but </w:t>
-      </w:r>
-      <w:proofErr w:type="spellStart"/>
-      <w:r>
-        <w:rPr>
-          <w:rFonts w:cstheme="minorHAnsi"/>
-        </w:rPr>
-        <w:t>TaskForge's</w:t>
-      </w:r>
-      <w:proofErr w:type="spellEnd"/>
-      <w:r>
-        <w:rPr>
-          <w:rFonts w:cstheme="minorHAnsi"/>
-        </w:rPr>
-        <w:t xml:space="preserve"> responsibility is </w:t>
+        <w:t xml:space="preserve"> Since we are advised to keep the design relatively small, we deliberately do not model cameras, budgets, contracts, crew members, costumes, etc. as separate systems. They can appear as the subject of tasks, but TaskForge's responsibility is </w:t>
       </w:r>
       <w:r>
         <w:rPr>
@@ -2046,29 +1514,13 @@
     </w:p>
     <w:p>
       <w:r>
-        <w:t xml:space="preserve">Ownership: </w:t>
-      </w:r>
-      <w:proofErr w:type="spellStart"/>
-      <w:r>
-        <w:t>WorkGroup</w:t>
-      </w:r>
-      <w:proofErr w:type="spellEnd"/>
-      <w:r>
-        <w:t xml:space="preserve"> owns its children</w:t>
+        <w:t>Ownership: WorkGroup owns its children</w:t>
       </w:r>
       <w:r>
         <w:t xml:space="preserve">. </w:t>
       </w:r>
       <w:r>
-        <w:t xml:space="preserve">Decorators own the component they wrap. Each Shot owns its current </w:t>
-      </w:r>
-      <w:proofErr w:type="spellStart"/>
-      <w:r>
-        <w:t>ShotState</w:t>
-      </w:r>
-      <w:proofErr w:type="spellEnd"/>
-      <w:r>
-        <w:t xml:space="preserve">. Iterators hold only non-owning raw pointers. This produces </w:t>
+        <w:t xml:space="preserve">Decorators own the component they wrap. Each Shot owns its current ShotState. Iterators hold only non-owning raw pointers. This produces </w:t>
       </w:r>
       <w:r>
         <w:t xml:space="preserve">leak-free </w:t>
@@ -2096,35 +1548,25 @@
     </w:p>
     <w:p>
       <w:r>
-        <w:t>Decorator applicability: Decorators can be applied to both individual Shots and</w:t>
+        <w:t xml:space="preserve">Decorator </w:t>
+      </w:r>
+      <w:r>
+        <w:t>wrapping</w:t>
+      </w:r>
+      <w:r>
+        <w:t>: Decorators can be applied to both individual Shots and</w:t>
       </w:r>
       <w:r>
         <w:t xml:space="preserve"> </w:t>
       </w:r>
       <w:r>
-        <w:t xml:space="preserve">to </w:t>
-      </w:r>
-      <w:proofErr w:type="spellStart"/>
-      <w:r>
-        <w:t>WorkGroups</w:t>
-      </w:r>
-      <w:proofErr w:type="spellEnd"/>
-      <w:r>
-        <w:t>. Stacking order is significant</w:t>
+        <w:t>to WorkGroups. Stacking order is significant</w:t>
       </w:r>
       <w:r>
         <w:t>. For example,</w:t>
       </w:r>
       <w:r>
-        <w:t xml:space="preserve"> P</w:t>
-      </w:r>
-      <w:proofErr w:type="spellStart"/>
-      <w:r>
-        <w:t>riorityDecorator</w:t>
-      </w:r>
-      <w:proofErr w:type="spellEnd"/>
-      <w:r>
-        <w:t xml:space="preserve"> outermost so that priority queries see the full decorated behaviour</w:t>
+        <w:t xml:space="preserve"> PriorityDecorator outermost so that priority queries see the full decorated behaviour</w:t>
       </w:r>
       <w:r>
         <w:t xml:space="preserve">. </w:t>
@@ -2132,18 +1574,10 @@
     </w:p>
     <w:p>
       <w:r>
-        <w:t>I</w:t>
-      </w:r>
-      <w:r>
-        <w:t xml:space="preserve">nternal containers: Client code never receives the raw container of a </w:t>
-      </w:r>
-      <w:proofErr w:type="spellStart"/>
-      <w:r>
-        <w:t>WorkGroup</w:t>
-      </w:r>
-      <w:proofErr w:type="spellEnd"/>
-      <w:r>
-        <w:t>. All traversal is performed exclusively through iterators.</w:t>
+        <w:t>Narrow interface</w:t>
+      </w:r>
+      <w:r>
+        <w:t>: Client code never receives the raw container of a WorkGroup. All traversal is performed exclusively through iterators.</w:t>
       </w:r>
     </w:p>
     <w:p>
@@ -2181,15 +1615,7 @@
     <w:p/>
     <w:p>
       <w:r>
-        <w:t xml:space="preserve">Object diagram representing </w:t>
-      </w:r>
-      <w:proofErr w:type="spellStart"/>
-      <w:r>
-        <w:t>FimProduction</w:t>
-      </w:r>
-      <w:proofErr w:type="spellEnd"/>
-      <w:r>
-        <w:t xml:space="preserve"> hierarchy and decorator wrapping after the execution of Scenario 2 in main.cpp</w:t>
+        <w:t>Object diagram representing FimProduction hierarchy and decorator wrapping after the execution of Scenario 2 in main.cpp</w:t>
       </w:r>
     </w:p>
     <w:p>
@@ -2249,13 +1675,8 @@
     <w:p>
       <w:r>
         <w:lastRenderedPageBreak/>
-        <w:t xml:space="preserve">State diagram representing states of a </w:t>
-      </w:r>
-      <w:proofErr w:type="spellStart"/>
-      <w:r>
-        <w:t>productionTask</w:t>
-      </w:r>
-      <w:proofErr w:type="spellEnd"/>
+        <w:t>State diagram representing states of a productionTask</w:t>
+      </w:r>
     </w:p>
     <w:p>
       <w:r>
@@ -2363,13 +1784,8 @@
     <w:p>
       <w:r>
         <w:lastRenderedPageBreak/>
-        <w:t xml:space="preserve">Activity diagram 2 representing the flow of the Iterator class with </w:t>
-      </w:r>
-      <w:proofErr w:type="spellStart"/>
-      <w:r>
-        <w:t>productionTask</w:t>
-      </w:r>
-      <w:proofErr w:type="spellEnd"/>
+        <w:t>Activity diagram 2 representing the flow of the Iterator class with productionTask</w:t>
+      </w:r>
     </w:p>
     <w:p>
       <w:r>
@@ -2421,13 +1837,8 @@
     </w:p>
     <w:p>
       <w:r>
-        <w:t xml:space="preserve">Activity diagram representing the flow of states in </w:t>
-      </w:r>
-      <w:proofErr w:type="spellStart"/>
-      <w:r>
-        <w:t>productionTask</w:t>
-      </w:r>
-      <w:proofErr w:type="spellEnd"/>
+        <w:t>Activity diagram representing the flow of states in productionTask</w:t>
+      </w:r>
     </w:p>
     <w:p>
       <w:r>
@@ -2492,15 +1903,7 @@
     <w:p/>
     <w:p>
       <w:r>
-        <w:t xml:space="preserve">Using </w:t>
-      </w:r>
-      <w:proofErr w:type="spellStart"/>
-      <w:r>
-        <w:t>gdb</w:t>
-      </w:r>
-      <w:proofErr w:type="spellEnd"/>
-      <w:r>
-        <w:t xml:space="preserve"> while implementing:</w:t>
+        <w:t>Using gdb while implementing:</w:t>
       </w:r>
     </w:p>
     <w:p>
@@ -2595,13 +1998,8 @@
       </w:r>
     </w:p>
     <w:p>
-      <w:proofErr w:type="spellStart"/>
-      <w:r>
-        <w:t>taskforge</w:t>
-      </w:r>
-      <w:proofErr w:type="spellEnd"/>
-      <w:r>
-        <w:t xml:space="preserve"> builds cleanly but crashes with a segmentation fault at program shutdown, after printing all of Scenario 2's output. A subtler tell shows up earlier too: the "</w:t>
+      <w:r>
+        <w:t>taskforge builds cleanly but crashes with a segmentation fault at program shutdown, after printing all of Scenario 2's output. A subtler tell shows up earlier too: the "</w:t>
       </w:r>
       <w:r>
         <w:t>new</w:t>
@@ -2660,52 +2058,7 @@
     </w:p>
     <w:p>
       <w:r>
-        <w:t xml:space="preserve">In the weather-disruption scenario, the task added Set Up Lighting to </w:t>
-      </w:r>
-      <w:proofErr w:type="spellStart"/>
-      <w:r>
-        <w:t>warehouseClimax</w:t>
-      </w:r>
-      <w:proofErr w:type="spellEnd"/>
-      <w:r>
-        <w:t xml:space="preserve"> but never called </w:t>
-      </w:r>
-      <w:proofErr w:type="spellStart"/>
-      <w:r>
-        <w:t>harborOpening</w:t>
-      </w:r>
-      <w:proofErr w:type="spellEnd"/>
-      <w:r>
-        <w:t xml:space="preserve">-&gt;remove(...) first. The same </w:t>
-      </w:r>
-      <w:proofErr w:type="spellStart"/>
-      <w:r>
-        <w:t>ProductionTask</w:t>
-      </w:r>
-      <w:proofErr w:type="spellEnd"/>
-      <w:r>
-        <w:t xml:space="preserve">* was now in two </w:t>
-      </w:r>
-      <w:proofErr w:type="spellStart"/>
-      <w:proofErr w:type="gramStart"/>
-      <w:r>
-        <w:t>WorkGroup</w:t>
-      </w:r>
-      <w:proofErr w:type="spellEnd"/>
-      <w:r>
-        <w:t>::children</w:t>
-      </w:r>
-      <w:proofErr w:type="gramEnd"/>
-      <w:r>
-        <w:t xml:space="preserve"> vectors. Both are </w:t>
-      </w:r>
-      <w:proofErr w:type="spellStart"/>
-      <w:r>
-        <w:t>WorkGroup</w:t>
-      </w:r>
-      <w:proofErr w:type="spellEnd"/>
-      <w:r>
-        <w:t>, both own their children, and both delete every child in their destructor. The pointer gets deleted twice.</w:t>
+        <w:t>In the weather-disruption scenario, the task added Set Up Lighting to warehouseClimax but never called harborOpening-&gt;remove(...) first. The same ProductionTask* was now in two WorkGroup::children vectors. Both are WorkGroup, both own their children, and both delete every child in their destructor. The pointer gets deleted twice.</w:t>
       </w:r>
     </w:p>
     <w:p>
@@ -2804,76 +2157,24 @@
           <w:rFonts w:ascii="Courier New" w:hAnsi="Courier New" w:cs="Courier New"/>
         </w:rPr>
       </w:pPr>
-      <w:proofErr w:type="spellStart"/>
-      <w:proofErr w:type="gramStart"/>
       <w:r>
         <w:rPr>
           <w:rFonts w:ascii="Courier New" w:hAnsi="Courier New" w:cs="Courier New"/>
         </w:rPr>
-        <w:t>world.harborOpening</w:t>
-      </w:r>
-      <w:proofErr w:type="spellEnd"/>
-      <w:proofErr w:type="gramEnd"/>
-      <w:r>
+        <w:t>world.harborOpening-&gt;remove(world.setUpLighting);</w:t>
+      </w:r>
+    </w:p>
+    <w:p>
+      <w:pPr>
         <w:rPr>
           <w:rFonts w:ascii="Courier New" w:hAnsi="Courier New" w:cs="Courier New"/>
         </w:rPr>
-        <w:t>-&gt;remove(</w:t>
-      </w:r>
-      <w:proofErr w:type="spellStart"/>
-      <w:proofErr w:type="gramStart"/>
+      </w:pPr>
       <w:r>
         <w:rPr>
           <w:rFonts w:ascii="Courier New" w:hAnsi="Courier New" w:cs="Courier New"/>
         </w:rPr>
-        <w:t>world.setUpLighting</w:t>
-      </w:r>
-      <w:proofErr w:type="spellEnd"/>
-      <w:proofErr w:type="gramEnd"/>
-      <w:r>
-        <w:rPr>
-          <w:rFonts w:ascii="Courier New" w:hAnsi="Courier New" w:cs="Courier New"/>
-        </w:rPr>
-        <w:t>);</w:t>
-      </w:r>
-    </w:p>
-    <w:p>
-      <w:pPr>
-        <w:rPr>
-          <w:rFonts w:ascii="Courier New" w:hAnsi="Courier New" w:cs="Courier New"/>
-        </w:rPr>
-      </w:pPr>
-      <w:proofErr w:type="spellStart"/>
-      <w:proofErr w:type="gramStart"/>
-      <w:r>
-        <w:rPr>
-          <w:rFonts w:ascii="Courier New" w:hAnsi="Courier New" w:cs="Courier New"/>
-        </w:rPr>
-        <w:t>world.warehouseClimax</w:t>
-      </w:r>
-      <w:proofErr w:type="spellEnd"/>
-      <w:proofErr w:type="gramEnd"/>
-      <w:r>
-        <w:rPr>
-          <w:rFonts w:ascii="Courier New" w:hAnsi="Courier New" w:cs="Courier New"/>
-        </w:rPr>
-        <w:t>-&gt;add(</w:t>
-      </w:r>
-      <w:proofErr w:type="spellStart"/>
-      <w:proofErr w:type="gramStart"/>
-      <w:r>
-        <w:rPr>
-          <w:rFonts w:ascii="Courier New" w:hAnsi="Courier New" w:cs="Courier New"/>
-        </w:rPr>
-        <w:t>world.setUpLighting</w:t>
-      </w:r>
-      <w:proofErr w:type="spellEnd"/>
-      <w:proofErr w:type="gramEnd"/>
-      <w:r>
-        <w:rPr>
-          <w:rFonts w:ascii="Courier New" w:hAnsi="Courier New" w:cs="Courier New"/>
-        </w:rPr>
-        <w:t>);</w:t>
+        <w:t>world.warehouseClimax-&gt;add(world.setUpLighting);</w:t>
       </w:r>
     </w:p>
     <w:p>

</xml_diff>